<commit_message>
Questionnaire v2: website hosting, investor email policy, server details, document vault, preferred domains
Adds questions on where ZIDA's website is hosted and which emails investors
may use; captures server configuration if ZIDA hosts, how documents are
organised today (for BridgeVault migration) and 2-3 preferred domains.
Responses requested at earliest convenience; From: Afronovation Team.

Co-Authored-By: Claude Opus 5.5 <noreply@anthropic.com>
Claude-Session: https://claude.ai/code/session_01X474181YGTsF16kamYY3c3
</commit_message>
<xml_diff>
--- a/docs/pre-implementation/ZIDA-Implementation-Readiness-Questionnaire-v2.docx
+++ b/docs/pre-implementation/ZIDA-Implementation-Readiness-Questionnaire-v2.docx
@@ -108,13 +108,13 @@
         <w:tblLayout w:type="fixed"/>
       </w:tblPr>
       <w:tblGrid>
-        <w:gridCol w:w="3200"/>
-        <w:gridCol w:w="6438"/>
+        <w:gridCol w:w="3700"/>
+        <w:gridCol w:w="5938"/>
       </w:tblGrid>
       <w:tr>
         <w:tc>
           <w:tcPr>
-            <w:tcW w:type="dxa" w:w="3200"/>
+            <w:tcW w:type="dxa" w:w="3700"/>
             <w:tcBorders>
               <w:top w:val="single" w:color="C9D3CD" w:sz="4"/>
               <w:left w:val="single" w:color="C9D3CD" w:sz="4"/>
@@ -148,7 +148,7 @@
         </w:tc>
         <w:tc>
           <w:tcPr>
-            <w:tcW w:type="dxa" w:w="6438"/>
+            <w:tcW w:type="dxa" w:w="5938"/>
             <w:tcBorders>
               <w:top w:val="single" w:color="C9D3CD" w:sz="4"/>
               <w:left w:val="single" w:color="C9D3CD" w:sz="4"/>
@@ -180,7 +180,7 @@
       <w:tr>
         <w:tc>
           <w:tcPr>
-            <w:tcW w:type="dxa" w:w="3200"/>
+            <w:tcW w:type="dxa" w:w="3700"/>
             <w:tcBorders>
               <w:top w:val="single" w:color="C9D3CD" w:sz="4"/>
               <w:left w:val="single" w:color="C9D3CD" w:sz="4"/>
@@ -214,7 +214,7 @@
         </w:tc>
         <w:tc>
           <w:tcPr>
-            <w:tcW w:type="dxa" w:w="6438"/>
+            <w:tcW w:type="dxa" w:w="5938"/>
             <w:tcBorders>
               <w:top w:val="single" w:color="C9D3CD" w:sz="4"/>
               <w:left w:val="single" w:color="C9D3CD" w:sz="4"/>
@@ -246,7 +246,7 @@
       <w:tr>
         <w:tc>
           <w:tcPr>
-            <w:tcW w:type="dxa" w:w="3200"/>
+            <w:tcW w:type="dxa" w:w="3700"/>
             <w:tcBorders>
               <w:top w:val="single" w:color="C9D3CD" w:sz="4"/>
               <w:left w:val="single" w:color="C9D3CD" w:sz="4"/>
@@ -280,7 +280,7 @@
         </w:tc>
         <w:tc>
           <w:tcPr>
-            <w:tcW w:type="dxa" w:w="6438"/>
+            <w:tcW w:type="dxa" w:w="5938"/>
             <w:tcBorders>
               <w:top w:val="single" w:color="C9D3CD" w:sz="4"/>
               <w:left w:val="single" w:color="C9D3CD" w:sz="4"/>
@@ -304,7 +304,7 @@
                 <w:sz w:val="21"/>
                 <w:szCs w:val="21"/>
               </w:rPr>
-              <w:t xml:space="preserve">Afronovation</w:t>
+              <w:t xml:space="preserve">Afronovation Team</w:t>
             </w:r>
           </w:p>
         </w:tc>
@@ -312,7 +312,7 @@
       <w:tr>
         <w:tc>
           <w:tcPr>
-            <w:tcW w:type="dxa" w:w="3200"/>
+            <w:tcW w:type="dxa" w:w="3700"/>
             <w:tcBorders>
               <w:top w:val="single" w:color="C9D3CD" w:sz="4"/>
               <w:left w:val="single" w:color="C9D3CD" w:sz="4"/>
@@ -346,7 +346,7 @@
         </w:tc>
         <w:tc>
           <w:tcPr>
-            <w:tcW w:type="dxa" w:w="6438"/>
+            <w:tcW w:type="dxa" w:w="5938"/>
             <w:tcBorders>
               <w:top w:val="single" w:color="C9D3CD" w:sz="4"/>
               <w:left w:val="single" w:color="C9D3CD" w:sz="4"/>
@@ -378,7 +378,7 @@
       <w:tr>
         <w:tc>
           <w:tcPr>
-            <w:tcW w:type="dxa" w:w="3200"/>
+            <w:tcW w:type="dxa" w:w="3700"/>
             <w:tcBorders>
               <w:top w:val="single" w:color="C9D3CD" w:sz="4"/>
               <w:left w:val="single" w:color="C9D3CD" w:sz="4"/>
@@ -406,13 +406,13 @@
                 <w:sz w:val="21"/>
                 <w:szCs w:val="21"/>
               </w:rPr>
-              <w:t xml:space="preserve">Responses due to Afronovation by</w:t>
+              <w:t xml:space="preserve">Responses due to Afronovation</w:t>
             </w:r>
           </w:p>
         </w:tc>
         <w:tc>
           <w:tcPr>
-            <w:tcW w:type="dxa" w:w="6438"/>
+            <w:tcW w:type="dxa" w:w="5938"/>
             <w:tcBorders>
               <w:top w:val="single" w:color="C9D3CD" w:sz="4"/>
               <w:left w:val="single" w:color="C9D3CD" w:sz="4"/>
@@ -436,7 +436,7 @@
                 <w:sz w:val="21"/>
                 <w:szCs w:val="21"/>
               </w:rPr>
-              <w:t xml:space="preserve">19 October 2026</w:t>
+              <w:t xml:space="preserve">At your earliest convenience</w:t>
             </w:r>
           </w:p>
         </w:tc>
@@ -444,7 +444,7 @@
       <w:tr>
         <w:tc>
           <w:tcPr>
-            <w:tcW w:type="dxa" w:w="3200"/>
+            <w:tcW w:type="dxa" w:w="3700"/>
             <w:tcBorders>
               <w:top w:val="single" w:color="C9D3CD" w:sz="4"/>
               <w:left w:val="single" w:color="C9D3CD" w:sz="4"/>
@@ -478,7 +478,7 @@
         </w:tc>
         <w:tc>
           <w:tcPr>
-            <w:tcW w:type="dxa" w:w="6438"/>
+            <w:tcW w:type="dxa" w:w="5938"/>
             <w:tcBorders>
               <w:top w:val="single" w:color="C9D3CD" w:sz="4"/>
               <w:left w:val="single" w:color="C9D3CD" w:sz="4"/>
@@ -612,7 +612,7 @@
           <w:sz w:val="21"/>
           <w:szCs w:val="21"/>
         </w:rPr>
-        <w:t xml:space="preserve">Please attach copies of the documents listed in the Attachments checklist, and return everything to Afronovation by the date above.</w:t>
+        <w:t xml:space="preserve">Please attach copies of the documents listed in the Attachments checklist, and return everything to Afronovation with the form at your earliest convenience.</w:t>
       </w:r>
     </w:p>
     <w:p>
@@ -1079,7 +1079,7 @@
           <w:sz w:val="21"/>
           <w:szCs w:val="21"/>
         </w:rPr>
-        <w:t xml:space="preserve">Where is this project information kept today?</w:t>
+        <w:t xml:space="preserve">Where are ZIDA’s project documents and information kept today?</w:t>
       </w:r>
       <w:r>
         <w:rPr>
@@ -1111,7 +1111,7 @@
           <w:sz w:val="21"/>
           <w:szCs w:val="21"/>
         </w:rPr>
-        <w:t xml:space="preserve">Word or PDF files</w:t>
+        <w:t xml:space="preserve">Word or PDF files on computers</w:t>
       </w:r>
     </w:p>
     <w:p>
@@ -1135,6 +1135,29 @@
           <w:szCs w:val="21"/>
         </w:rPr>
         <w:t xml:space="preserve">Excel spreadsheets</w:t>
+      </w:r>
+    </w:p>
+    <w:p>
+      <w:pPr>
+        <w:keepNext/>
+        <w:spacing w:after="30"/>
+        <w:ind w:left="500"/>
+      </w:pPr>
+      <w:r>
+        <w:rPr>
+          <w:rFonts w:ascii="Calibri" w:cs="Calibri" w:eastAsia="Calibri" w:hAnsi="Calibri"/>
+          <w:sz w:val="24"/>
+          <w:szCs w:val="24"/>
+        </w:rPr>
+        <w:t xml:space="preserve">☐  </w:t>
+      </w:r>
+      <w:r>
+        <w:rPr>
+          <w:rFonts w:ascii="Calibri" w:cs="Calibri" w:eastAsia="Calibri" w:hAnsi="Calibri"/>
+          <w:sz w:val="21"/>
+          <w:szCs w:val="21"/>
+        </w:rPr>
+        <w:t xml:space="preserve">A shared drive or cloud storage (e.g. SharePoint, Google Drive)</w:t>
       </w:r>
     </w:p>
     <w:p>
@@ -1279,170 +1302,6 @@
     <w:p>
       <w:pPr>
         <w:keepNext/>
-        <w:pBdr>
-          <w:bottom w:val="single" w:color="B8860B" w:sz="6" w:space="4"/>
-        </w:pBdr>
-        <w:spacing w:after="60" w:before="300"/>
-      </w:pPr>
-      <w:r>
-        <w:rPr>
-          <w:rFonts w:ascii="Calibri" w:cs="Calibri" w:eastAsia="Calibri" w:hAnsi="Calibri"/>
-          <w:b/>
-          <w:bCs/>
-          <w:color w:val="14532D"/>
-          <w:sz w:val="28"/>
-          <w:szCs w:val="28"/>
-        </w:rPr>
-        <w:t xml:space="preserve">2.  Hosting</w:t>
-      </w:r>
-    </w:p>
-    <w:p>
-      <w:pPr>
-        <w:spacing w:after="100"/>
-      </w:pPr>
-      <w:r>
-        <w:rPr>
-          <w:rFonts w:ascii="Calibri" w:cs="Calibri" w:eastAsia="Calibri" w:hAnsi="Calibri"/>
-          <w:i/>
-          <w:iCs/>
-          <w:color w:val="5F6B66"/>
-          <w:sz w:val="21"/>
-          <w:szCs w:val="21"/>
-        </w:rPr>
-        <w:t xml:space="preserve">Determines where and how the platform will run, and its cost.</w:t>
-      </w:r>
-    </w:p>
-    <w:p>
-      <w:pPr>
-        <w:keepNext/>
-        <w:spacing w:after="60" w:before="160"/>
-      </w:pPr>
-      <w:r>
-        <w:rPr>
-          <w:rFonts w:ascii="Calibri" w:cs="Calibri" w:eastAsia="Calibri" w:hAnsi="Calibri"/>
-          <w:b/>
-          <w:bCs/>
-          <w:color w:val="14532D"/>
-          <w:sz w:val="21"/>
-          <w:szCs w:val="21"/>
-        </w:rPr>
-        <w:t xml:space="preserve">4.  </w:t>
-      </w:r>
-      <w:r>
-        <w:rPr>
-          <w:rFonts w:ascii="Calibri" w:cs="Calibri" w:eastAsia="Calibri" w:hAnsi="Calibri"/>
-          <w:b/>
-          <w:bCs/>
-          <w:sz w:val="21"/>
-          <w:szCs w:val="21"/>
-        </w:rPr>
-        <w:t xml:space="preserve">Where are ZIDA’s website and IT systems hosted today?</w:t>
-      </w:r>
-      <w:r>
-        <w:rPr>
-          <w:rFonts w:ascii="Calibri" w:cs="Calibri" w:eastAsia="Calibri" w:hAnsi="Calibri"/>
-          <w:color w:val="5F6B66"/>
-          <w:sz w:val="18"/>
-          <w:szCs w:val="18"/>
-        </w:rPr>
-        <w:t xml:space="preserve">  (tick all that apply)</w:t>
-      </w:r>
-    </w:p>
-    <w:p>
-      <w:pPr>
-        <w:keepNext/>
-        <w:spacing w:after="30"/>
-        <w:ind w:left="500"/>
-      </w:pPr>
-      <w:r>
-        <w:rPr>
-          <w:rFonts w:ascii="Calibri" w:cs="Calibri" w:eastAsia="Calibri" w:hAnsi="Calibri"/>
-          <w:sz w:val="24"/>
-          <w:szCs w:val="24"/>
-        </w:rPr>
-        <w:t xml:space="preserve">☐  </w:t>
-      </w:r>
-      <w:r>
-        <w:rPr>
-          <w:rFonts w:ascii="Calibri" w:cs="Calibri" w:eastAsia="Calibri" w:hAnsi="Calibri"/>
-          <w:sz w:val="21"/>
-          <w:szCs w:val="21"/>
-        </w:rPr>
-        <w:t xml:space="preserve">ZIDA’s own server room</w:t>
-      </w:r>
-    </w:p>
-    <w:p>
-      <w:pPr>
-        <w:keepNext/>
-        <w:spacing w:after="30"/>
-        <w:ind w:left="500"/>
-      </w:pPr>
-      <w:r>
-        <w:rPr>
-          <w:rFonts w:ascii="Calibri" w:cs="Calibri" w:eastAsia="Calibri" w:hAnsi="Calibri"/>
-          <w:sz w:val="24"/>
-          <w:szCs w:val="24"/>
-        </w:rPr>
-        <w:t xml:space="preserve">☐  </w:t>
-      </w:r>
-      <w:r>
-        <w:rPr>
-          <w:rFonts w:ascii="Calibri" w:cs="Calibri" w:eastAsia="Calibri" w:hAnsi="Calibri"/>
-          <w:sz w:val="21"/>
-          <w:szCs w:val="21"/>
-        </w:rPr>
-        <w:t xml:space="preserve">A local hosting provider in Zimbabwe</w:t>
-      </w:r>
-    </w:p>
-    <w:p>
-      <w:pPr>
-        <w:keepNext/>
-        <w:spacing w:after="30"/>
-        <w:ind w:left="500"/>
-      </w:pPr>
-      <w:r>
-        <w:rPr>
-          <w:rFonts w:ascii="Calibri" w:cs="Calibri" w:eastAsia="Calibri" w:hAnsi="Calibri"/>
-          <w:sz w:val="24"/>
-          <w:szCs w:val="24"/>
-        </w:rPr>
-        <w:t xml:space="preserve">☐  </w:t>
-      </w:r>
-      <w:r>
-        <w:rPr>
-          <w:rFonts w:ascii="Calibri" w:cs="Calibri" w:eastAsia="Calibri" w:hAnsi="Calibri"/>
-          <w:sz w:val="21"/>
-          <w:szCs w:val="21"/>
-        </w:rPr>
-        <w:t xml:space="preserve">A cloud service (e.g. Microsoft, Google, Amazon)</w:t>
-      </w:r>
-    </w:p>
-    <w:p>
-      <w:pPr>
-        <w:keepNext/>
-        <w:spacing w:after="30"/>
-        <w:ind w:left="500"/>
-      </w:pPr>
-      <w:r>
-        <w:rPr>
-          <w:rFonts w:ascii="Calibri" w:cs="Calibri" w:eastAsia="Calibri" w:hAnsi="Calibri"/>
-          <w:sz w:val="24"/>
-          <w:szCs w:val="24"/>
-        </w:rPr>
-        <w:t xml:space="preserve">☐  </w:t>
-      </w:r>
-      <w:r>
-        <w:rPr>
-          <w:rFonts w:ascii="Calibri" w:cs="Calibri" w:eastAsia="Calibri" w:hAnsi="Calibri"/>
-          <w:sz w:val="21"/>
-          <w:szCs w:val="21"/>
-        </w:rPr>
-        <w:t xml:space="preserve">Not sure</w:t>
-      </w:r>
-    </w:p>
-    <w:p>
-      <w:pPr>
-        <w:keepNext/>
         <w:spacing w:after="30" w:before="60"/>
         <w:ind w:left="500"/>
       </w:pPr>
@@ -1453,7 +1312,7 @@
           <w:sz w:val="19"/>
           <w:szCs w:val="19"/>
         </w:rPr>
-        <w:t xml:space="preserve">Provider name, if known</w:t>
+        <w:t xml:space="preserve">How are documents organised today (e.g. folders by sector or project)?</w:t>
       </w:r>
     </w:p>
     <w:tbl>
@@ -1512,313 +1371,19 @@
     </w:tbl>
     <w:p>
       <w:pPr>
-        <w:keepNext/>
-        <w:spacing w:after="60" w:before="160"/>
-      </w:pPr>
-      <w:r>
-        <w:rPr>
-          <w:rFonts w:ascii="Calibri" w:cs="Calibri" w:eastAsia="Calibri" w:hAnsi="Calibri"/>
-          <w:b/>
-          <w:bCs/>
+        <w:spacing w:before="60"/>
+        <w:ind w:left="500"/>
+      </w:pPr>
+      <w:r>
+        <w:rPr>
+          <w:rFonts w:ascii="Calibri" w:cs="Calibri" w:eastAsia="Calibri" w:hAnsi="Calibri"/>
+          <w:i/>
+          <w:iCs/>
           <w:color w:val="14532D"/>
-          <w:sz w:val="21"/>
-          <w:szCs w:val="21"/>
-        </w:rPr>
-        <w:t xml:space="preserve">5.  </w:t>
-      </w:r>
-      <w:r>
-        <w:rPr>
-          <w:rFonts w:ascii="Calibri" w:cs="Calibri" w:eastAsia="Calibri" w:hAnsi="Calibri"/>
-          <w:b/>
-          <w:bCs/>
-          <w:sz w:val="21"/>
-          <w:szCs w:val="21"/>
-        </w:rPr>
-        <w:t xml:space="preserve">Where would ZIDA prefer ZidaProject to be hosted?</w:t>
-      </w:r>
-    </w:p>
-    <w:p>
-      <w:pPr>
-        <w:keepNext/>
-        <w:spacing w:after="30"/>
-        <w:ind w:left="500"/>
-      </w:pPr>
-      <w:r>
-        <w:rPr>
-          <w:rFonts w:ascii="Calibri" w:cs="Calibri" w:eastAsia="Calibri" w:hAnsi="Calibri"/>
-          <w:sz w:val="24"/>
-          <w:szCs w:val="24"/>
-        </w:rPr>
-        <w:t xml:space="preserve">☐  </w:t>
-      </w:r>
-      <w:r>
-        <w:rPr>
-          <w:rFonts w:ascii="Calibri" w:cs="Calibri" w:eastAsia="Calibri" w:hAnsi="Calibri"/>
-          <w:sz w:val="21"/>
-          <w:szCs w:val="21"/>
-        </w:rPr>
-        <w:t xml:space="preserve">Afronovation hosts and manages it in a secure cloud</w:t>
-      </w:r>
-    </w:p>
-    <w:p>
-      <w:pPr>
-        <w:keepNext/>
-        <w:spacing w:after="30"/>
-        <w:ind w:left="500"/>
-      </w:pPr>
-      <w:r>
-        <w:rPr>
-          <w:rFonts w:ascii="Calibri" w:cs="Calibri" w:eastAsia="Calibri" w:hAnsi="Calibri"/>
-          <w:sz w:val="24"/>
-          <w:szCs w:val="24"/>
-        </w:rPr>
-        <w:t xml:space="preserve">☐  </w:t>
-      </w:r>
-      <w:r>
-        <w:rPr>
-          <w:rFonts w:ascii="Calibri" w:cs="Calibri" w:eastAsia="Calibri" w:hAnsi="Calibri"/>
-          <w:sz w:val="21"/>
-          <w:szCs w:val="21"/>
-        </w:rPr>
-        <w:t xml:space="preserve">On ZIDA’s own servers</w:t>
-      </w:r>
-    </w:p>
-    <w:p>
-      <w:pPr>
-        <w:keepNext/>
-        <w:spacing w:after="30"/>
-        <w:ind w:left="500"/>
-      </w:pPr>
-      <w:r>
-        <w:rPr>
-          <w:rFonts w:ascii="Calibri" w:cs="Calibri" w:eastAsia="Calibri" w:hAnsi="Calibri"/>
-          <w:sz w:val="24"/>
-          <w:szCs w:val="24"/>
-        </w:rPr>
-        <w:t xml:space="preserve">☐  </w:t>
-      </w:r>
-      <w:r>
-        <w:rPr>
-          <w:rFonts w:ascii="Calibri" w:cs="Calibri" w:eastAsia="Calibri" w:hAnsi="Calibri"/>
-          <w:sz w:val="21"/>
-          <w:szCs w:val="21"/>
-        </w:rPr>
-        <w:t xml:space="preserve">In ZIDA’s existing cloud account</w:t>
-      </w:r>
-    </w:p>
-    <w:p>
-      <w:pPr>
-        <w:keepNext/>
-        <w:spacing w:after="30"/>
-        <w:ind w:left="500"/>
-      </w:pPr>
-      <w:r>
-        <w:rPr>
-          <w:rFonts w:ascii="Calibri" w:cs="Calibri" w:eastAsia="Calibri" w:hAnsi="Calibri"/>
-          <w:sz w:val="24"/>
-          <w:szCs w:val="24"/>
-        </w:rPr>
-        <w:t xml:space="preserve">☐  </w:t>
-      </w:r>
-      <w:r>
-        <w:rPr>
-          <w:rFonts w:ascii="Calibri" w:cs="Calibri" w:eastAsia="Calibri" w:hAnsi="Calibri"/>
-          <w:sz w:val="21"/>
-          <w:szCs w:val="21"/>
-        </w:rPr>
-        <w:t xml:space="preserve">No preference — Afronovation to recommend</w:t>
-      </w:r>
-    </w:p>
-    <w:p>
-      <w:pPr>
-        <w:keepNext/>
-        <w:spacing w:after="60" w:before="160"/>
-      </w:pPr>
-      <w:r>
-        <w:rPr>
-          <w:rFonts w:ascii="Calibri" w:cs="Calibri" w:eastAsia="Calibri" w:hAnsi="Calibri"/>
-          <w:b/>
-          <w:bCs/>
-          <w:color w:val="14532D"/>
-          <w:sz w:val="21"/>
-          <w:szCs w:val="21"/>
-        </w:rPr>
-        <w:t xml:space="preserve">6.  </w:t>
-      </w:r>
-      <w:r>
-        <w:rPr>
-          <w:rFonts w:ascii="Calibri" w:cs="Calibri" w:eastAsia="Calibri" w:hAnsi="Calibri"/>
-          <w:b/>
-          <w:bCs/>
-          <w:sz w:val="21"/>
-          <w:szCs w:val="21"/>
-        </w:rPr>
-        <w:t xml:space="preserve">Must ZIDA’s data be stored inside Zimbabwe?</w:t>
-      </w:r>
-    </w:p>
-    <w:p>
-      <w:pPr>
-        <w:keepNext/>
-        <w:spacing w:after="30"/>
-        <w:ind w:left="500"/>
-      </w:pPr>
-      <w:r>
-        <w:rPr>
-          <w:rFonts w:ascii="Calibri" w:cs="Calibri" w:eastAsia="Calibri" w:hAnsi="Calibri"/>
-          <w:sz w:val="24"/>
-          <w:szCs w:val="24"/>
-        </w:rPr>
-        <w:t xml:space="preserve">☐  </w:t>
-      </w:r>
-      <w:r>
-        <w:rPr>
-          <w:rFonts w:ascii="Calibri" w:cs="Calibri" w:eastAsia="Calibri" w:hAnsi="Calibri"/>
-          <w:sz w:val="21"/>
-          <w:szCs w:val="21"/>
-        </w:rPr>
-        <w:t xml:space="preserve">Yes</w:t>
-      </w:r>
-    </w:p>
-    <w:p>
-      <w:pPr>
-        <w:keepNext/>
-        <w:spacing w:after="30"/>
-        <w:ind w:left="500"/>
-      </w:pPr>
-      <w:r>
-        <w:rPr>
-          <w:rFonts w:ascii="Calibri" w:cs="Calibri" w:eastAsia="Calibri" w:hAnsi="Calibri"/>
-          <w:sz w:val="24"/>
-          <w:szCs w:val="24"/>
-        </w:rPr>
-        <w:t xml:space="preserve">☐  </w:t>
-      </w:r>
-      <w:r>
-        <w:rPr>
-          <w:rFonts w:ascii="Calibri" w:cs="Calibri" w:eastAsia="Calibri" w:hAnsi="Calibri"/>
-          <w:sz w:val="21"/>
-          <w:szCs w:val="21"/>
-        </w:rPr>
-        <w:t xml:space="preserve">No</w:t>
-      </w:r>
-    </w:p>
-    <w:p>
-      <w:pPr>
-        <w:keepNext/>
-        <w:spacing w:after="30"/>
-        <w:ind w:left="500"/>
-      </w:pPr>
-      <w:r>
-        <w:rPr>
-          <w:rFonts w:ascii="Calibri" w:cs="Calibri" w:eastAsia="Calibri" w:hAnsi="Calibri"/>
-          <w:sz w:val="24"/>
-          <w:szCs w:val="24"/>
-        </w:rPr>
-        <w:t xml:space="preserve">☐  </w:t>
-      </w:r>
-      <w:r>
-        <w:rPr>
-          <w:rFonts w:ascii="Calibri" w:cs="Calibri" w:eastAsia="Calibri" w:hAnsi="Calibri"/>
-          <w:sz w:val="21"/>
-          <w:szCs w:val="21"/>
-        </w:rPr>
-        <w:t xml:space="preserve">Not sure</w:t>
-      </w:r>
-    </w:p>
-    <w:p>
-      <w:pPr>
-        <w:keepNext/>
-        <w:spacing w:after="60" w:before="160"/>
-      </w:pPr>
-      <w:r>
-        <w:rPr>
-          <w:rFonts w:ascii="Calibri" w:cs="Calibri" w:eastAsia="Calibri" w:hAnsi="Calibri"/>
-          <w:b/>
-          <w:bCs/>
-          <w:color w:val="14532D"/>
-          <w:sz w:val="21"/>
-          <w:szCs w:val="21"/>
-        </w:rPr>
-        <w:t xml:space="preserve">7.  </w:t>
-      </w:r>
-      <w:r>
-        <w:rPr>
-          <w:rFonts w:ascii="Calibri" w:cs="Calibri" w:eastAsia="Calibri" w:hAnsi="Calibri"/>
-          <w:b/>
-          <w:bCs/>
-          <w:sz w:val="21"/>
-          <w:szCs w:val="21"/>
-        </w:rPr>
-        <w:t xml:space="preserve">When does the platform need to be available?</w:t>
-      </w:r>
-    </w:p>
-    <w:p>
-      <w:pPr>
-        <w:keepNext/>
-        <w:spacing w:after="30"/>
-        <w:ind w:left="500"/>
-      </w:pPr>
-      <w:r>
-        <w:rPr>
-          <w:rFonts w:ascii="Calibri" w:cs="Calibri" w:eastAsia="Calibri" w:hAnsi="Calibri"/>
-          <w:sz w:val="24"/>
-          <w:szCs w:val="24"/>
-        </w:rPr>
-        <w:t xml:space="preserve">☐  </w:t>
-      </w:r>
-      <w:r>
-        <w:rPr>
-          <w:rFonts w:ascii="Calibri" w:cs="Calibri" w:eastAsia="Calibri" w:hAnsi="Calibri"/>
-          <w:sz w:val="21"/>
-          <w:szCs w:val="21"/>
-        </w:rPr>
-        <w:t xml:space="preserve">Office hours (Monday to Friday)</w:t>
-      </w:r>
-    </w:p>
-    <w:p>
-      <w:pPr>
-        <w:keepNext/>
-        <w:spacing w:after="30"/>
-        <w:ind w:left="500"/>
-      </w:pPr>
-      <w:r>
-        <w:rPr>
-          <w:rFonts w:ascii="Calibri" w:cs="Calibri" w:eastAsia="Calibri" w:hAnsi="Calibri"/>
-          <w:sz w:val="24"/>
-          <w:szCs w:val="24"/>
-        </w:rPr>
-        <w:t xml:space="preserve">☐  </w:t>
-      </w:r>
-      <w:r>
-        <w:rPr>
-          <w:rFonts w:ascii="Calibri" w:cs="Calibri" w:eastAsia="Calibri" w:hAnsi="Calibri"/>
-          <w:sz w:val="21"/>
-          <w:szCs w:val="21"/>
-        </w:rPr>
-        <w:t xml:space="preserve">Every day, 24 hours</w:t>
-      </w:r>
-    </w:p>
-    <w:p>
-      <w:pPr>
-        <w:keepNext/>
-        <w:spacing w:after="30"/>
-        <w:ind w:left="500"/>
-      </w:pPr>
-      <w:r>
-        <w:rPr>
-          <w:rFonts w:ascii="Calibri" w:cs="Calibri" w:eastAsia="Calibri" w:hAnsi="Calibri"/>
-          <w:sz w:val="24"/>
-          <w:szCs w:val="24"/>
-        </w:rPr>
-        <w:t xml:space="preserve">☐  </w:t>
-      </w:r>
-      <w:r>
-        <w:rPr>
-          <w:rFonts w:ascii="Calibri" w:cs="Calibri" w:eastAsia="Calibri" w:hAnsi="Calibri"/>
-          <w:sz w:val="21"/>
-          <w:szCs w:val="21"/>
-        </w:rPr>
-        <w:t xml:space="preserve">Not sure</w:t>
+          <w:sz w:val="19"/>
+          <w:szCs w:val="19"/>
+        </w:rPr>
+        <w:t xml:space="preserve">All documents will be migrated into ZidaProject’s secure document vault (BridgeVault) once they have been identified and organised.</w:t>
       </w:r>
     </w:p>
     <w:p>
@@ -1838,7 +1403,7 @@
           <w:sz w:val="28"/>
           <w:szCs w:val="28"/>
         </w:rPr>
-        <w:t xml:space="preserve">3.  Email, Web Address and Sign-in</w:t>
+        <w:t xml:space="preserve">2.  Hosting</w:t>
       </w:r>
     </w:p>
     <w:p>
@@ -1854,7 +1419,7 @@
           <w:sz w:val="21"/>
           <w:szCs w:val="21"/>
         </w:rPr>
-        <w:t xml:space="preserve">Lets platform emails and staff logins work with ZIDA’s existing accounts.</w:t>
+        <w:t xml:space="preserve">Determines where and how the platform will run, and its cost.</w:t>
       </w:r>
     </w:p>
     <w:p>
@@ -1871,7 +1436,7 @@
           <w:sz w:val="21"/>
           <w:szCs w:val="21"/>
         </w:rPr>
-        <w:t xml:space="preserve">8.  </w:t>
+        <w:t xml:space="preserve">4.  </w:t>
       </w:r>
       <w:r>
         <w:rPr>
@@ -1881,99 +1446,76 @@
           <w:sz w:val="21"/>
           <w:szCs w:val="21"/>
         </w:rPr>
-        <w:t xml:space="preserve">Which email service does ZIDA use?</w:t>
-      </w:r>
-    </w:p>
-    <w:p>
-      <w:pPr>
-        <w:keepNext/>
-        <w:spacing w:after="30"/>
-        <w:ind w:left="500"/>
-      </w:pPr>
-      <w:r>
-        <w:rPr>
-          <w:rFonts w:ascii="Calibri" w:cs="Calibri" w:eastAsia="Calibri" w:hAnsi="Calibri"/>
-          <w:sz w:val="24"/>
-          <w:szCs w:val="24"/>
-        </w:rPr>
-        <w:t xml:space="preserve">☐  </w:t>
-      </w:r>
-      <w:r>
-        <w:rPr>
-          <w:rFonts w:ascii="Calibri" w:cs="Calibri" w:eastAsia="Calibri" w:hAnsi="Calibri"/>
-          <w:sz w:val="21"/>
-          <w:szCs w:val="21"/>
-        </w:rPr>
-        <w:t xml:space="preserve">Microsoft 365 (Outlook)</w:t>
-      </w:r>
-    </w:p>
-    <w:p>
-      <w:pPr>
-        <w:keepNext/>
-        <w:spacing w:after="30"/>
-        <w:ind w:left="500"/>
-      </w:pPr>
-      <w:r>
-        <w:rPr>
-          <w:rFonts w:ascii="Calibri" w:cs="Calibri" w:eastAsia="Calibri" w:hAnsi="Calibri"/>
-          <w:sz w:val="24"/>
-          <w:szCs w:val="24"/>
-        </w:rPr>
-        <w:t xml:space="preserve">☐  </w:t>
-      </w:r>
-      <w:r>
-        <w:rPr>
-          <w:rFonts w:ascii="Calibri" w:cs="Calibri" w:eastAsia="Calibri" w:hAnsi="Calibri"/>
-          <w:sz w:val="21"/>
-          <w:szCs w:val="21"/>
-        </w:rPr>
-        <w:t xml:space="preserve">Google Workspace (Gmail)</w:t>
-      </w:r>
-    </w:p>
-    <w:p>
-      <w:pPr>
-        <w:keepNext/>
-        <w:spacing w:after="30"/>
-        <w:ind w:left="500"/>
-      </w:pPr>
-      <w:r>
-        <w:rPr>
-          <w:rFonts w:ascii="Calibri" w:cs="Calibri" w:eastAsia="Calibri" w:hAnsi="Calibri"/>
-          <w:sz w:val="24"/>
-          <w:szCs w:val="24"/>
-        </w:rPr>
-        <w:t xml:space="preserve">☐  </w:t>
-      </w:r>
-      <w:r>
-        <w:rPr>
-          <w:rFonts w:ascii="Calibri" w:cs="Calibri" w:eastAsia="Calibri" w:hAnsi="Calibri"/>
-          <w:sz w:val="21"/>
-          <w:szCs w:val="21"/>
-        </w:rPr>
-        <w:t xml:space="preserve">ZIDA’s own email server</w:t>
-      </w:r>
-    </w:p>
-    <w:p>
-      <w:pPr>
-        <w:keepNext/>
-        <w:spacing w:after="30"/>
-        <w:ind w:left="500"/>
-      </w:pPr>
-      <w:r>
-        <w:rPr>
-          <w:rFonts w:ascii="Calibri" w:cs="Calibri" w:eastAsia="Calibri" w:hAnsi="Calibri"/>
-          <w:sz w:val="24"/>
-          <w:szCs w:val="24"/>
-        </w:rPr>
-        <w:t xml:space="preserve">☐  </w:t>
-      </w:r>
-      <w:r>
-        <w:rPr>
-          <w:rFonts w:ascii="Calibri" w:cs="Calibri" w:eastAsia="Calibri" w:hAnsi="Calibri"/>
-          <w:sz w:val="21"/>
-          <w:szCs w:val="21"/>
-        </w:rPr>
-        <w:t xml:space="preserve">Other</w:t>
+        <w:t xml:space="preserve">Where is ZIDA’s own website hosted?</w:t>
+      </w:r>
+    </w:p>
+    <w:p>
+      <w:pPr>
+        <w:keepNext/>
+        <w:spacing w:after="30"/>
+        <w:ind w:left="500"/>
+      </w:pPr>
+      <w:r>
+        <w:rPr>
+          <w:rFonts w:ascii="Calibri" w:cs="Calibri" w:eastAsia="Calibri" w:hAnsi="Calibri"/>
+          <w:sz w:val="24"/>
+          <w:szCs w:val="24"/>
+        </w:rPr>
+        <w:t xml:space="preserve">☐  </w:t>
+      </w:r>
+      <w:r>
+        <w:rPr>
+          <w:rFonts w:ascii="Calibri" w:cs="Calibri" w:eastAsia="Calibri" w:hAnsi="Calibri"/>
+          <w:sz w:val="21"/>
+          <w:szCs w:val="21"/>
+        </w:rPr>
+        <w:t xml:space="preserve">ZIDA’s own server</w:t>
+      </w:r>
+    </w:p>
+    <w:p>
+      <w:pPr>
+        <w:keepNext/>
+        <w:spacing w:after="30"/>
+        <w:ind w:left="500"/>
+      </w:pPr>
+      <w:r>
+        <w:rPr>
+          <w:rFonts w:ascii="Calibri" w:cs="Calibri" w:eastAsia="Calibri" w:hAnsi="Calibri"/>
+          <w:sz w:val="24"/>
+          <w:szCs w:val="24"/>
+        </w:rPr>
+        <w:t xml:space="preserve">☐  </w:t>
+      </w:r>
+      <w:r>
+        <w:rPr>
+          <w:rFonts w:ascii="Calibri" w:cs="Calibri" w:eastAsia="Calibri" w:hAnsi="Calibri"/>
+          <w:sz w:val="21"/>
+          <w:szCs w:val="21"/>
+        </w:rPr>
+        <w:t xml:space="preserve">A local hosting provider in Zimbabwe</w:t>
+      </w:r>
+    </w:p>
+    <w:p>
+      <w:pPr>
+        <w:keepNext/>
+        <w:spacing w:after="30"/>
+        <w:ind w:left="500"/>
+      </w:pPr>
+      <w:r>
+        <w:rPr>
+          <w:rFonts w:ascii="Calibri" w:cs="Calibri" w:eastAsia="Calibri" w:hAnsi="Calibri"/>
+          <w:sz w:val="24"/>
+          <w:szCs w:val="24"/>
+        </w:rPr>
+        <w:t xml:space="preserve">☐  </w:t>
+      </w:r>
+      <w:r>
+        <w:rPr>
+          <w:rFonts w:ascii="Calibri" w:cs="Calibri" w:eastAsia="Calibri" w:hAnsi="Calibri"/>
+          <w:sz w:val="21"/>
+          <w:szCs w:val="21"/>
+        </w:rPr>
+        <w:t xml:space="preserve">A cloud service (e.g. Microsoft, Google, Amazon)</w:t>
       </w:r>
     </w:p>
     <w:p>
@@ -2012,7 +1554,7 @@
           <w:sz w:val="19"/>
           <w:szCs w:val="19"/>
         </w:rPr>
-        <w:t xml:space="preserve">ZIDA email domain (the part after @)</w:t>
+        <w:t xml:space="preserve">Hosting provider name, if known</w:t>
       </w:r>
     </w:p>
     <w:tbl>
@@ -2072,102 +1614,6 @@
     <w:p>
       <w:pPr>
         <w:keepNext/>
-        <w:spacing w:after="60" w:before="160"/>
-      </w:pPr>
-      <w:r>
-        <w:rPr>
-          <w:rFonts w:ascii="Calibri" w:cs="Calibri" w:eastAsia="Calibri" w:hAnsi="Calibri"/>
-          <w:b/>
-          <w:bCs/>
-          <w:color w:val="14532D"/>
-          <w:sz w:val="21"/>
-          <w:szCs w:val="21"/>
-        </w:rPr>
-        <w:t xml:space="preserve">9.  </w:t>
-      </w:r>
-      <w:r>
-        <w:rPr>
-          <w:rFonts w:ascii="Calibri" w:cs="Calibri" w:eastAsia="Calibri" w:hAnsi="Calibri"/>
-          <w:b/>
-          <w:bCs/>
-          <w:sz w:val="21"/>
-          <w:szCs w:val="21"/>
-        </w:rPr>
-        <w:t xml:space="preserve">Which web address should the platform use?</w:t>
-      </w:r>
-    </w:p>
-    <w:p>
-      <w:pPr>
-        <w:keepNext/>
-        <w:spacing w:after="30"/>
-        <w:ind w:left="500"/>
-      </w:pPr>
-      <w:r>
-        <w:rPr>
-          <w:rFonts w:ascii="Calibri" w:cs="Calibri" w:eastAsia="Calibri" w:hAnsi="Calibri"/>
-          <w:sz w:val="24"/>
-          <w:szCs w:val="24"/>
-        </w:rPr>
-        <w:t xml:space="preserve">☐  </w:t>
-      </w:r>
-      <w:r>
-        <w:rPr>
-          <w:rFonts w:ascii="Calibri" w:cs="Calibri" w:eastAsia="Calibri" w:hAnsi="Calibri"/>
-          <w:sz w:val="21"/>
-          <w:szCs w:val="21"/>
-        </w:rPr>
-        <w:t xml:space="preserve">Keep zidaproject.com</w:t>
-      </w:r>
-    </w:p>
-    <w:p>
-      <w:pPr>
-        <w:keepNext/>
-        <w:spacing w:after="30"/>
-        <w:ind w:left="500"/>
-      </w:pPr>
-      <w:r>
-        <w:rPr>
-          <w:rFonts w:ascii="Calibri" w:cs="Calibri" w:eastAsia="Calibri" w:hAnsi="Calibri"/>
-          <w:sz w:val="24"/>
-          <w:szCs w:val="24"/>
-        </w:rPr>
-        <w:t xml:space="preserve">☐  </w:t>
-      </w:r>
-      <w:r>
-        <w:rPr>
-          <w:rFonts w:ascii="Calibri" w:cs="Calibri" w:eastAsia="Calibri" w:hAnsi="Calibri"/>
-          <w:sz w:val="21"/>
-          <w:szCs w:val="21"/>
-        </w:rPr>
-        <w:t xml:space="preserve">A ZIDA web address</w:t>
-      </w:r>
-    </w:p>
-    <w:p>
-      <w:pPr>
-        <w:keepNext/>
-        <w:spacing w:after="30"/>
-        <w:ind w:left="500"/>
-      </w:pPr>
-      <w:r>
-        <w:rPr>
-          <w:rFonts w:ascii="Calibri" w:cs="Calibri" w:eastAsia="Calibri" w:hAnsi="Calibri"/>
-          <w:sz w:val="24"/>
-          <w:szCs w:val="24"/>
-        </w:rPr>
-        <w:t xml:space="preserve">☐  </w:t>
-      </w:r>
-      <w:r>
-        <w:rPr>
-          <w:rFonts w:ascii="Calibri" w:cs="Calibri" w:eastAsia="Calibri" w:hAnsi="Calibri"/>
-          <w:sz w:val="21"/>
-          <w:szCs w:val="21"/>
-        </w:rPr>
-        <w:t xml:space="preserve">Not sure</w:t>
-      </w:r>
-    </w:p>
-    <w:p>
-      <w:pPr>
-        <w:keepNext/>
         <w:spacing w:after="30" w:before="60"/>
         <w:ind w:left="500"/>
       </w:pPr>
@@ -2178,7 +1624,7 @@
           <w:sz w:val="19"/>
           <w:szCs w:val="19"/>
         </w:rPr>
-        <w:t xml:space="preserve">Who manages ZIDA’s web address (domain) today?</w:t>
+        <w:t xml:space="preserve">What is the website built with, if known (e.g. WordPress)?</w:t>
       </w:r>
     </w:p>
     <w:tbl>
@@ -2237,6 +1683,23 @@
     </w:tbl>
     <w:p>
       <w:pPr>
+        <w:spacing w:before="60"/>
+        <w:ind w:left="500"/>
+      </w:pPr>
+      <w:r>
+        <w:rPr>
+          <w:rFonts w:ascii="Calibri" w:cs="Calibri" w:eastAsia="Calibri" w:hAnsi="Calibri"/>
+          <w:i/>
+          <w:iCs/>
+          <w:color w:val="14532D"/>
+          <w:sz w:val="19"/>
+          <w:szCs w:val="19"/>
+        </w:rPr>
+        <w:t xml:space="preserve">This helps us confirm technical compatibility for a smooth implementation and migration.</w:t>
+      </w:r>
+    </w:p>
+    <w:p>
+      <w:pPr>
         <w:keepNext/>
         <w:spacing w:after="60" w:before="160"/>
       </w:pPr>
@@ -2249,7 +1712,7 @@
           <w:sz w:val="21"/>
           <w:szCs w:val="21"/>
         </w:rPr>
-        <w:t xml:space="preserve">10.  </w:t>
+        <w:t xml:space="preserve">5.  </w:t>
       </w:r>
       <w:r>
         <w:rPr>
@@ -2259,185 +1722,85 @@
           <w:sz w:val="21"/>
           <w:szCs w:val="21"/>
         </w:rPr>
-        <w:t xml:space="preserve">Should ZIDA staff sign in using their existing ZIDA work account?</w:t>
-      </w:r>
-    </w:p>
-    <w:p>
-      <w:pPr>
-        <w:keepNext/>
-        <w:spacing w:after="30"/>
-        <w:ind w:left="500"/>
-      </w:pPr>
-      <w:r>
-        <w:rPr>
-          <w:rFonts w:ascii="Calibri" w:cs="Calibri" w:eastAsia="Calibri" w:hAnsi="Calibri"/>
-          <w:sz w:val="24"/>
-          <w:szCs w:val="24"/>
-        </w:rPr>
-        <w:t xml:space="preserve">☐  </w:t>
-      </w:r>
-      <w:r>
-        <w:rPr>
-          <w:rFonts w:ascii="Calibri" w:cs="Calibri" w:eastAsia="Calibri" w:hAnsi="Calibri"/>
-          <w:sz w:val="21"/>
-          <w:szCs w:val="21"/>
-        </w:rPr>
-        <w:t xml:space="preserve">Yes</w:t>
-      </w:r>
-    </w:p>
-    <w:p>
-      <w:pPr>
-        <w:keepNext/>
-        <w:spacing w:after="30"/>
-        <w:ind w:left="500"/>
-      </w:pPr>
-      <w:r>
-        <w:rPr>
-          <w:rFonts w:ascii="Calibri" w:cs="Calibri" w:eastAsia="Calibri" w:hAnsi="Calibri"/>
-          <w:sz w:val="24"/>
-          <w:szCs w:val="24"/>
-        </w:rPr>
-        <w:t xml:space="preserve">☐  </w:t>
-      </w:r>
-      <w:r>
-        <w:rPr>
-          <w:rFonts w:ascii="Calibri" w:cs="Calibri" w:eastAsia="Calibri" w:hAnsi="Calibri"/>
-          <w:sz w:val="21"/>
-          <w:szCs w:val="21"/>
-        </w:rPr>
-        <w:t xml:space="preserve">No, a separate login is fine</w:t>
-      </w:r>
-    </w:p>
-    <w:p>
-      <w:pPr>
-        <w:keepNext/>
-        <w:spacing w:after="30"/>
-        <w:ind w:left="500"/>
-      </w:pPr>
-      <w:r>
-        <w:rPr>
-          <w:rFonts w:ascii="Calibri" w:cs="Calibri" w:eastAsia="Calibri" w:hAnsi="Calibri"/>
-          <w:sz w:val="24"/>
-          <w:szCs w:val="24"/>
-        </w:rPr>
-        <w:t xml:space="preserve">☐  </w:t>
-      </w:r>
-      <w:r>
-        <w:rPr>
-          <w:rFonts w:ascii="Calibri" w:cs="Calibri" w:eastAsia="Calibri" w:hAnsi="Calibri"/>
-          <w:sz w:val="21"/>
-          <w:szCs w:val="21"/>
-        </w:rPr>
-        <w:t xml:space="preserve">Not sure</w:t>
-      </w:r>
-    </w:p>
-    <w:p>
-      <w:pPr>
-        <w:keepNext/>
-        <w:pBdr>
-          <w:bottom w:val="single" w:color="B8860B" w:sz="6" w:space="4"/>
-        </w:pBdr>
-        <w:spacing w:after="60" w:before="300"/>
-      </w:pPr>
-      <w:r>
-        <w:rPr>
-          <w:rFonts w:ascii="Calibri" w:cs="Calibri" w:eastAsia="Calibri" w:hAnsi="Calibri"/>
-          <w:b/>
-          <w:bCs/>
-          <w:color w:val="14532D"/>
-          <w:sz w:val="28"/>
-          <w:szCs w:val="28"/>
-        </w:rPr>
-        <w:t xml:space="preserve">4.  Connections and Processes</w:t>
-      </w:r>
-    </w:p>
-    <w:p>
-      <w:pPr>
-        <w:spacing w:after="100"/>
-      </w:pPr>
-      <w:r>
-        <w:rPr>
-          <w:rFonts w:ascii="Calibri" w:cs="Calibri" w:eastAsia="Calibri" w:hAnsi="Calibri"/>
-          <w:i/>
-          <w:iCs/>
+        <w:t xml:space="preserve">Where are ZIDA’s other IT systems hosted today?</w:t>
+      </w:r>
+      <w:r>
+        <w:rPr>
+          <w:rFonts w:ascii="Calibri" w:cs="Calibri" w:eastAsia="Calibri" w:hAnsi="Calibri"/>
           <w:color w:val="5F6B66"/>
-          <w:sz w:val="21"/>
-          <w:szCs w:val="21"/>
-        </w:rPr>
-        <w:t xml:space="preserve">Shows how ZidaProject fits with ZIDA’s other platforms and ways of working.</w:t>
-      </w:r>
-    </w:p>
-    <w:p>
-      <w:pPr>
-        <w:keepNext/>
-        <w:spacing w:after="60" w:before="160"/>
-      </w:pPr>
-      <w:r>
-        <w:rPr>
-          <w:rFonts w:ascii="Calibri" w:cs="Calibri" w:eastAsia="Calibri" w:hAnsi="Calibri"/>
-          <w:b/>
-          <w:bCs/>
-          <w:color w:val="14532D"/>
-          <w:sz w:val="21"/>
-          <w:szCs w:val="21"/>
-        </w:rPr>
-        <w:t xml:space="preserve">11.  </w:t>
-      </w:r>
-      <w:r>
-        <w:rPr>
-          <w:rFonts w:ascii="Calibri" w:cs="Calibri" w:eastAsia="Calibri" w:hAnsi="Calibri"/>
-          <w:b/>
-          <w:bCs/>
-          <w:sz w:val="21"/>
-          <w:szCs w:val="21"/>
-        </w:rPr>
-        <w:t xml:space="preserve">Should ZidaProject connect with other ZIDA-owned platforms, or run independently?</w:t>
-      </w:r>
-    </w:p>
-    <w:p>
-      <w:pPr>
-        <w:keepNext/>
-        <w:spacing w:after="30"/>
-        <w:ind w:left="500"/>
-      </w:pPr>
-      <w:r>
-        <w:rPr>
-          <w:rFonts w:ascii="Calibri" w:cs="Calibri" w:eastAsia="Calibri" w:hAnsi="Calibri"/>
-          <w:sz w:val="24"/>
-          <w:szCs w:val="24"/>
-        </w:rPr>
-        <w:t xml:space="preserve">☐  </w:t>
-      </w:r>
-      <w:r>
-        <w:rPr>
-          <w:rFonts w:ascii="Calibri" w:cs="Calibri" w:eastAsia="Calibri" w:hAnsi="Calibri"/>
-          <w:sz w:val="21"/>
-          <w:szCs w:val="21"/>
-        </w:rPr>
-        <w:t xml:space="preserve">Run independently</w:t>
-      </w:r>
-    </w:p>
-    <w:p>
-      <w:pPr>
-        <w:keepNext/>
-        <w:spacing w:after="30"/>
-        <w:ind w:left="500"/>
-      </w:pPr>
-      <w:r>
-        <w:rPr>
-          <w:rFonts w:ascii="Calibri" w:cs="Calibri" w:eastAsia="Calibri" w:hAnsi="Calibri"/>
-          <w:sz w:val="24"/>
-          <w:szCs w:val="24"/>
-        </w:rPr>
-        <w:t xml:space="preserve">☐  </w:t>
-      </w:r>
-      <w:r>
-        <w:rPr>
-          <w:rFonts w:ascii="Calibri" w:cs="Calibri" w:eastAsia="Calibri" w:hAnsi="Calibri"/>
-          <w:sz w:val="21"/>
-          <w:szCs w:val="21"/>
-        </w:rPr>
-        <w:t xml:space="preserve">Connect with other ZIDA platforms (name them below)</w:t>
+          <w:sz w:val="18"/>
+          <w:szCs w:val="18"/>
+        </w:rPr>
+        <w:t xml:space="preserve">  (tick all that apply)</w:t>
+      </w:r>
+    </w:p>
+    <w:p>
+      <w:pPr>
+        <w:keepNext/>
+        <w:spacing w:after="30"/>
+        <w:ind w:left="500"/>
+      </w:pPr>
+      <w:r>
+        <w:rPr>
+          <w:rFonts w:ascii="Calibri" w:cs="Calibri" w:eastAsia="Calibri" w:hAnsi="Calibri"/>
+          <w:sz w:val="24"/>
+          <w:szCs w:val="24"/>
+        </w:rPr>
+        <w:t xml:space="preserve">☐  </w:t>
+      </w:r>
+      <w:r>
+        <w:rPr>
+          <w:rFonts w:ascii="Calibri" w:cs="Calibri" w:eastAsia="Calibri" w:hAnsi="Calibri"/>
+          <w:sz w:val="21"/>
+          <w:szCs w:val="21"/>
+        </w:rPr>
+        <w:t xml:space="preserve">ZIDA’s own server room</w:t>
+      </w:r>
+    </w:p>
+    <w:p>
+      <w:pPr>
+        <w:keepNext/>
+        <w:spacing w:after="30"/>
+        <w:ind w:left="500"/>
+      </w:pPr>
+      <w:r>
+        <w:rPr>
+          <w:rFonts w:ascii="Calibri" w:cs="Calibri" w:eastAsia="Calibri" w:hAnsi="Calibri"/>
+          <w:sz w:val="24"/>
+          <w:szCs w:val="24"/>
+        </w:rPr>
+        <w:t xml:space="preserve">☐  </w:t>
+      </w:r>
+      <w:r>
+        <w:rPr>
+          <w:rFonts w:ascii="Calibri" w:cs="Calibri" w:eastAsia="Calibri" w:hAnsi="Calibri"/>
+          <w:sz w:val="21"/>
+          <w:szCs w:val="21"/>
+        </w:rPr>
+        <w:t xml:space="preserve">A local hosting provider in Zimbabwe</w:t>
+      </w:r>
+    </w:p>
+    <w:p>
+      <w:pPr>
+        <w:keepNext/>
+        <w:spacing w:after="30"/>
+        <w:ind w:left="500"/>
+      </w:pPr>
+      <w:r>
+        <w:rPr>
+          <w:rFonts w:ascii="Calibri" w:cs="Calibri" w:eastAsia="Calibri" w:hAnsi="Calibri"/>
+          <w:sz w:val="24"/>
+          <w:szCs w:val="24"/>
+        </w:rPr>
+        <w:t xml:space="preserve">☐  </w:t>
+      </w:r>
+      <w:r>
+        <w:rPr>
+          <w:rFonts w:ascii="Calibri" w:cs="Calibri" w:eastAsia="Calibri" w:hAnsi="Calibri"/>
+          <w:sz w:val="21"/>
+          <w:szCs w:val="21"/>
+        </w:rPr>
+        <w:t xml:space="preserve">A cloud service (e.g. Microsoft, Google, Amazon)</w:t>
       </w:r>
     </w:p>
     <w:p>
@@ -2476,7 +1839,7 @@
           <w:sz w:val="19"/>
           <w:szCs w:val="19"/>
         </w:rPr>
-        <w:t xml:space="preserve">Platforms to connect (e.g. ZIDA website, investment licensing, CRM)</w:t>
+        <w:t xml:space="preserve">Provider name, if known</w:t>
       </w:r>
     </w:p>
     <w:tbl>
@@ -2547,7 +1910,7 @@
           <w:sz w:val="21"/>
           <w:szCs w:val="21"/>
         </w:rPr>
-        <w:t xml:space="preserve">12.  </w:t>
+        <w:t xml:space="preserve">6.  </w:t>
       </w:r>
       <w:r>
         <w:rPr>
@@ -2557,154 +1920,99 @@
           <w:sz w:val="21"/>
           <w:szCs w:val="21"/>
         </w:rPr>
-        <w:t xml:space="preserve">Which ZIDA processes should the platform support or reflect?</w:t>
-      </w:r>
-      <w:r>
-        <w:rPr>
-          <w:rFonts w:ascii="Calibri" w:cs="Calibri" w:eastAsia="Calibri" w:hAnsi="Calibri"/>
-          <w:color w:val="5F6B66"/>
-          <w:sz w:val="18"/>
-          <w:szCs w:val="18"/>
-        </w:rPr>
-        <w:t xml:space="preserve">  (tick all that apply)</w:t>
-      </w:r>
-    </w:p>
-    <w:p>
-      <w:pPr>
-        <w:keepNext/>
-        <w:spacing w:after="30"/>
-        <w:ind w:left="500"/>
-      </w:pPr>
-      <w:r>
-        <w:rPr>
-          <w:rFonts w:ascii="Calibri" w:cs="Calibri" w:eastAsia="Calibri" w:hAnsi="Calibri"/>
-          <w:sz w:val="24"/>
-          <w:szCs w:val="24"/>
-        </w:rPr>
-        <w:t xml:space="preserve">☐  </w:t>
-      </w:r>
-      <w:r>
-        <w:rPr>
-          <w:rFonts w:ascii="Calibri" w:cs="Calibri" w:eastAsia="Calibri" w:hAnsi="Calibri"/>
-          <w:sz w:val="21"/>
-          <w:szCs w:val="21"/>
-        </w:rPr>
-        <w:t xml:space="preserve">Project intake and onboarding</w:t>
-      </w:r>
-    </w:p>
-    <w:p>
-      <w:pPr>
-        <w:keepNext/>
-        <w:spacing w:after="30"/>
-        <w:ind w:left="500"/>
-      </w:pPr>
-      <w:r>
-        <w:rPr>
-          <w:rFonts w:ascii="Calibri" w:cs="Calibri" w:eastAsia="Calibri" w:hAnsi="Calibri"/>
-          <w:sz w:val="24"/>
-          <w:szCs w:val="24"/>
-        </w:rPr>
-        <w:t xml:space="preserve">☐  </w:t>
-      </w:r>
-      <w:r>
-        <w:rPr>
-          <w:rFonts w:ascii="Calibri" w:cs="Calibri" w:eastAsia="Calibri" w:hAnsi="Calibri"/>
-          <w:sz w:val="21"/>
-          <w:szCs w:val="21"/>
-        </w:rPr>
-        <w:t xml:space="preserve">Project scoring or ranking</w:t>
-      </w:r>
-    </w:p>
-    <w:p>
-      <w:pPr>
-        <w:keepNext/>
-        <w:spacing w:after="30"/>
-        <w:ind w:left="500"/>
-      </w:pPr>
-      <w:r>
-        <w:rPr>
-          <w:rFonts w:ascii="Calibri" w:cs="Calibri" w:eastAsia="Calibri" w:hAnsi="Calibri"/>
-          <w:sz w:val="24"/>
-          <w:szCs w:val="24"/>
-        </w:rPr>
-        <w:t xml:space="preserve">☐  </w:t>
-      </w:r>
-      <w:r>
-        <w:rPr>
-          <w:rFonts w:ascii="Calibri" w:cs="Calibri" w:eastAsia="Calibri" w:hAnsi="Calibri"/>
-          <w:sz w:val="21"/>
-          <w:szCs w:val="21"/>
-        </w:rPr>
-        <w:t xml:space="preserve">Project review and approval</w:t>
-      </w:r>
-    </w:p>
-    <w:p>
-      <w:pPr>
-        <w:keepNext/>
-        <w:spacing w:after="30"/>
-        <w:ind w:left="500"/>
-      </w:pPr>
-      <w:r>
-        <w:rPr>
-          <w:rFonts w:ascii="Calibri" w:cs="Calibri" w:eastAsia="Calibri" w:hAnsi="Calibri"/>
-          <w:sz w:val="24"/>
-          <w:szCs w:val="24"/>
-        </w:rPr>
-        <w:t xml:space="preserve">☐  </w:t>
-      </w:r>
-      <w:r>
-        <w:rPr>
-          <w:rFonts w:ascii="Calibri" w:cs="Calibri" w:eastAsia="Calibri" w:hAnsi="Calibri"/>
-          <w:sz w:val="21"/>
-          <w:szCs w:val="21"/>
-        </w:rPr>
-        <w:t xml:space="preserve">Investor registration and screening</w:t>
-      </w:r>
-    </w:p>
-    <w:p>
-      <w:pPr>
-        <w:keepNext/>
-        <w:spacing w:after="30"/>
-        <w:ind w:left="500"/>
-      </w:pPr>
-      <w:r>
-        <w:rPr>
-          <w:rFonts w:ascii="Calibri" w:cs="Calibri" w:eastAsia="Calibri" w:hAnsi="Calibri"/>
-          <w:sz w:val="24"/>
-          <w:szCs w:val="24"/>
-        </w:rPr>
-        <w:t xml:space="preserve">☐  </w:t>
-      </w:r>
-      <w:r>
-        <w:rPr>
-          <w:rFonts w:ascii="Calibri" w:cs="Calibri" w:eastAsia="Calibri" w:hAnsi="Calibri"/>
-          <w:sz w:val="21"/>
-          <w:szCs w:val="21"/>
-        </w:rPr>
-        <w:t xml:space="preserve">Reporting to management or the Board</w:t>
-      </w:r>
-    </w:p>
-    <w:p>
-      <w:pPr>
-        <w:keepNext/>
-        <w:spacing w:after="30"/>
-        <w:ind w:left="500"/>
-      </w:pPr>
-      <w:r>
-        <w:rPr>
-          <w:rFonts w:ascii="Calibri" w:cs="Calibri" w:eastAsia="Calibri" w:hAnsi="Calibri"/>
-          <w:sz w:val="24"/>
-          <w:szCs w:val="24"/>
-        </w:rPr>
-        <w:t xml:space="preserve">☐  </w:t>
-      </w:r>
-      <w:r>
-        <w:rPr>
-          <w:rFonts w:ascii="Calibri" w:cs="Calibri" w:eastAsia="Calibri" w:hAnsi="Calibri"/>
-          <w:sz w:val="21"/>
-          <w:szCs w:val="21"/>
-        </w:rPr>
-        <w:t xml:space="preserve">Other</w:t>
+        <w:t xml:space="preserve">Where would ZIDA prefer ZidaProject to be hosted?</w:t>
+      </w:r>
+    </w:p>
+    <w:p>
+      <w:pPr>
+        <w:keepNext/>
+        <w:spacing w:after="30"/>
+        <w:ind w:left="500"/>
+      </w:pPr>
+      <w:r>
+        <w:rPr>
+          <w:rFonts w:ascii="Calibri" w:cs="Calibri" w:eastAsia="Calibri" w:hAnsi="Calibri"/>
+          <w:sz w:val="24"/>
+          <w:szCs w:val="24"/>
+        </w:rPr>
+        <w:t xml:space="preserve">☐  </w:t>
+      </w:r>
+      <w:r>
+        <w:rPr>
+          <w:rFonts w:ascii="Calibri" w:cs="Calibri" w:eastAsia="Calibri" w:hAnsi="Calibri"/>
+          <w:sz w:val="21"/>
+          <w:szCs w:val="21"/>
+        </w:rPr>
+        <w:t xml:space="preserve">Afronovation hosts and manages it in a secure cloud</w:t>
+      </w:r>
+    </w:p>
+    <w:p>
+      <w:pPr>
+        <w:keepNext/>
+        <w:spacing w:after="30"/>
+        <w:ind w:left="500"/>
+      </w:pPr>
+      <w:r>
+        <w:rPr>
+          <w:rFonts w:ascii="Calibri" w:cs="Calibri" w:eastAsia="Calibri" w:hAnsi="Calibri"/>
+          <w:sz w:val="24"/>
+          <w:szCs w:val="24"/>
+        </w:rPr>
+        <w:t xml:space="preserve">☐  </w:t>
+      </w:r>
+      <w:r>
+        <w:rPr>
+          <w:rFonts w:ascii="Calibri" w:cs="Calibri" w:eastAsia="Calibri" w:hAnsi="Calibri"/>
+          <w:sz w:val="21"/>
+          <w:szCs w:val="21"/>
+        </w:rPr>
+        <w:t xml:space="preserve">On ZIDA’s own servers</w:t>
+      </w:r>
+    </w:p>
+    <w:p>
+      <w:pPr>
+        <w:keepNext/>
+        <w:spacing w:after="30"/>
+        <w:ind w:left="500"/>
+      </w:pPr>
+      <w:r>
+        <w:rPr>
+          <w:rFonts w:ascii="Calibri" w:cs="Calibri" w:eastAsia="Calibri" w:hAnsi="Calibri"/>
+          <w:sz w:val="24"/>
+          <w:szCs w:val="24"/>
+        </w:rPr>
+        <w:t xml:space="preserve">☐  </w:t>
+      </w:r>
+      <w:r>
+        <w:rPr>
+          <w:rFonts w:ascii="Calibri" w:cs="Calibri" w:eastAsia="Calibri" w:hAnsi="Calibri"/>
+          <w:sz w:val="21"/>
+          <w:szCs w:val="21"/>
+        </w:rPr>
+        <w:t xml:space="preserve">In ZIDA’s existing cloud account</w:t>
+      </w:r>
+    </w:p>
+    <w:p>
+      <w:pPr>
+        <w:keepNext/>
+        <w:spacing w:after="30"/>
+        <w:ind w:left="500"/>
+      </w:pPr>
+      <w:r>
+        <w:rPr>
+          <w:rFonts w:ascii="Calibri" w:cs="Calibri" w:eastAsia="Calibri" w:hAnsi="Calibri"/>
+          <w:sz w:val="24"/>
+          <w:szCs w:val="24"/>
+        </w:rPr>
+        <w:t xml:space="preserve">☐  </w:t>
+      </w:r>
+      <w:r>
+        <w:rPr>
+          <w:rFonts w:ascii="Calibri" w:cs="Calibri" w:eastAsia="Calibri" w:hAnsi="Calibri"/>
+          <w:sz w:val="21"/>
+          <w:szCs w:val="21"/>
+        </w:rPr>
+        <w:t xml:space="preserve">No preference — Afronovation to recommend</w:t>
       </w:r>
     </w:p>
     <w:p>
@@ -2720,7 +2028,7 @@
           <w:sz w:val="19"/>
           <w:szCs w:val="19"/>
         </w:rPr>
-        <w:t xml:space="preserve">Brief description of these processes</w:t>
+        <w:t xml:space="preserve">If on ZIDA’s own servers or cloud account: which one (provider or data centre)?</w:t>
       </w:r>
     </w:p>
     <w:tbl>
@@ -2779,6 +2087,76 @@
     </w:tbl>
     <w:p>
       <w:pPr>
+        <w:keepNext/>
+        <w:spacing w:after="30" w:before="60"/>
+        <w:ind w:left="500"/>
+      </w:pPr>
+      <w:r>
+        <w:rPr>
+          <w:rFonts w:ascii="Calibri" w:cs="Calibri" w:eastAsia="Calibri" w:hAnsi="Calibri"/>
+          <w:color w:val="5F6B66"/>
+          <w:sz w:val="19"/>
+          <w:szCs w:val="19"/>
+        </w:rPr>
+        <w:t xml:space="preserve">Server details, if known: operating system, processor (CPU), memory (RAM), storage, database and web server</w:t>
+      </w:r>
+    </w:p>
+    <w:tbl>
+      <w:tblPr>
+        <w:tblW w:type="dxa" w:w="9138"/>
+        <w:tblInd w:type="dxa" w:w="500"/>
+        <w:tblBorders>
+          <w:top w:val="single" w:color="auto" w:sz="4"/>
+          <w:left w:val="single" w:color="auto" w:sz="4"/>
+          <w:bottom w:val="single" w:color="auto" w:sz="4"/>
+          <w:right w:val="single" w:color="auto" w:sz="4"/>
+          <w:insideH w:val="single" w:color="auto" w:sz="4"/>
+          <w:insideV w:val="single" w:color="auto" w:sz="4"/>
+        </w:tblBorders>
+        <w:tblLayout w:type="fixed"/>
+      </w:tblPr>
+      <w:tblGrid>
+        <w:gridCol w:w="9138"/>
+      </w:tblGrid>
+      <w:tr>
+        <w:trPr>
+          <w:trHeight w:val="1100" w:hRule="atLeast"/>
+        </w:trPr>
+        <w:tc>
+          <w:tcPr>
+            <w:tcW w:type="dxa" w:w="9138"/>
+            <w:tcBorders>
+              <w:top w:val="single" w:color="C9D3CD" w:sz="4"/>
+              <w:left w:val="single" w:color="C9D3CD" w:sz="4"/>
+              <w:bottom w:val="single" w:color="C9D3CD" w:sz="4"/>
+              <w:right w:val="single" w:color="C9D3CD" w:sz="4"/>
+            </w:tcBorders>
+            <w:shd w:fill="F4F8FC" w:color="auto" w:val="clear"/>
+            <w:tcMar>
+              <w:top w:type="dxa" w:w="60"/>
+              <w:left w:type="dxa" w:w="100"/>
+              <w:bottom w:type="dxa" w:w="60"/>
+              <w:right w:type="dxa" w:w="100"/>
+            </w:tcMar>
+          </w:tcPr>
+          <w:p>
+            <w:pPr>
+              <w:spacing w:after="100"/>
+            </w:pPr>
+            <w:r>
+              <w:rPr>
+                <w:rFonts w:ascii="Calibri" w:cs="Calibri" w:eastAsia="Calibri" w:hAnsi="Calibri"/>
+                <w:sz w:val="21"/>
+                <w:szCs w:val="21"/>
+              </w:rPr>
+              <w:t xml:space="preserve"/>
+            </w:r>
+          </w:p>
+        </w:tc>
+      </w:tr>
+    </w:tbl>
+    <w:p>
+      <w:pPr>
         <w:spacing w:before="60"/>
         <w:ind w:left="500"/>
       </w:pPr>
@@ -2791,7 +2169,199 @@
           <w:sz w:val="19"/>
           <w:szCs w:val="19"/>
         </w:rPr>
-        <w:t xml:space="preserve">Please attach copies of the related process documents, forms, templates and scoring sheets.</w:t>
+        <w:t xml:space="preserve">If ZIDA hosts the platform, Afronovation will align ZidaProject to the server and can share the exact specification for a dedicated server instance.</w:t>
+      </w:r>
+    </w:p>
+    <w:p>
+      <w:pPr>
+        <w:keepNext/>
+        <w:spacing w:after="60" w:before="160"/>
+      </w:pPr>
+      <w:r>
+        <w:rPr>
+          <w:rFonts w:ascii="Calibri" w:cs="Calibri" w:eastAsia="Calibri" w:hAnsi="Calibri"/>
+          <w:b/>
+          <w:bCs/>
+          <w:color w:val="14532D"/>
+          <w:sz w:val="21"/>
+          <w:szCs w:val="21"/>
+        </w:rPr>
+        <w:t xml:space="preserve">7.  </w:t>
+      </w:r>
+      <w:r>
+        <w:rPr>
+          <w:rFonts w:ascii="Calibri" w:cs="Calibri" w:eastAsia="Calibri" w:hAnsi="Calibri"/>
+          <w:b/>
+          <w:bCs/>
+          <w:sz w:val="21"/>
+          <w:szCs w:val="21"/>
+        </w:rPr>
+        <w:t xml:space="preserve">Must ZIDA’s data be stored inside Zimbabwe?</w:t>
+      </w:r>
+    </w:p>
+    <w:p>
+      <w:pPr>
+        <w:keepNext/>
+        <w:spacing w:after="30"/>
+        <w:ind w:left="500"/>
+      </w:pPr>
+      <w:r>
+        <w:rPr>
+          <w:rFonts w:ascii="Calibri" w:cs="Calibri" w:eastAsia="Calibri" w:hAnsi="Calibri"/>
+          <w:sz w:val="24"/>
+          <w:szCs w:val="24"/>
+        </w:rPr>
+        <w:t xml:space="preserve">☐  </w:t>
+      </w:r>
+      <w:r>
+        <w:rPr>
+          <w:rFonts w:ascii="Calibri" w:cs="Calibri" w:eastAsia="Calibri" w:hAnsi="Calibri"/>
+          <w:sz w:val="21"/>
+          <w:szCs w:val="21"/>
+        </w:rPr>
+        <w:t xml:space="preserve">Yes</w:t>
+      </w:r>
+    </w:p>
+    <w:p>
+      <w:pPr>
+        <w:keepNext/>
+        <w:spacing w:after="30"/>
+        <w:ind w:left="500"/>
+      </w:pPr>
+      <w:r>
+        <w:rPr>
+          <w:rFonts w:ascii="Calibri" w:cs="Calibri" w:eastAsia="Calibri" w:hAnsi="Calibri"/>
+          <w:sz w:val="24"/>
+          <w:szCs w:val="24"/>
+        </w:rPr>
+        <w:t xml:space="preserve">☐  </w:t>
+      </w:r>
+      <w:r>
+        <w:rPr>
+          <w:rFonts w:ascii="Calibri" w:cs="Calibri" w:eastAsia="Calibri" w:hAnsi="Calibri"/>
+          <w:sz w:val="21"/>
+          <w:szCs w:val="21"/>
+        </w:rPr>
+        <w:t xml:space="preserve">No</w:t>
+      </w:r>
+    </w:p>
+    <w:p>
+      <w:pPr>
+        <w:keepNext/>
+        <w:spacing w:after="30"/>
+        <w:ind w:left="500"/>
+      </w:pPr>
+      <w:r>
+        <w:rPr>
+          <w:rFonts w:ascii="Calibri" w:cs="Calibri" w:eastAsia="Calibri" w:hAnsi="Calibri"/>
+          <w:sz w:val="24"/>
+          <w:szCs w:val="24"/>
+        </w:rPr>
+        <w:t xml:space="preserve">☐  </w:t>
+      </w:r>
+      <w:r>
+        <w:rPr>
+          <w:rFonts w:ascii="Calibri" w:cs="Calibri" w:eastAsia="Calibri" w:hAnsi="Calibri"/>
+          <w:sz w:val="21"/>
+          <w:szCs w:val="21"/>
+        </w:rPr>
+        <w:t xml:space="preserve">Not sure</w:t>
+      </w:r>
+    </w:p>
+    <w:p>
+      <w:pPr>
+        <w:keepNext/>
+        <w:spacing w:after="60" w:before="160"/>
+      </w:pPr>
+      <w:r>
+        <w:rPr>
+          <w:rFonts w:ascii="Calibri" w:cs="Calibri" w:eastAsia="Calibri" w:hAnsi="Calibri"/>
+          <w:b/>
+          <w:bCs/>
+          <w:color w:val="14532D"/>
+          <w:sz w:val="21"/>
+          <w:szCs w:val="21"/>
+        </w:rPr>
+        <w:t xml:space="preserve">8.  </w:t>
+      </w:r>
+      <w:r>
+        <w:rPr>
+          <w:rFonts w:ascii="Calibri" w:cs="Calibri" w:eastAsia="Calibri" w:hAnsi="Calibri"/>
+          <w:b/>
+          <w:bCs/>
+          <w:sz w:val="21"/>
+          <w:szCs w:val="21"/>
+        </w:rPr>
+        <w:t xml:space="preserve">When does the platform need to be available?</w:t>
+      </w:r>
+    </w:p>
+    <w:p>
+      <w:pPr>
+        <w:keepNext/>
+        <w:spacing w:after="30"/>
+        <w:ind w:left="500"/>
+      </w:pPr>
+      <w:r>
+        <w:rPr>
+          <w:rFonts w:ascii="Calibri" w:cs="Calibri" w:eastAsia="Calibri" w:hAnsi="Calibri"/>
+          <w:sz w:val="24"/>
+          <w:szCs w:val="24"/>
+        </w:rPr>
+        <w:t xml:space="preserve">☐  </w:t>
+      </w:r>
+      <w:r>
+        <w:rPr>
+          <w:rFonts w:ascii="Calibri" w:cs="Calibri" w:eastAsia="Calibri" w:hAnsi="Calibri"/>
+          <w:sz w:val="21"/>
+          <w:szCs w:val="21"/>
+        </w:rPr>
+        <w:t xml:space="preserve">Office hours (Monday to Friday)</w:t>
+      </w:r>
+    </w:p>
+    <w:p>
+      <w:pPr>
+        <w:keepNext/>
+        <w:spacing w:after="30"/>
+        <w:ind w:left="500"/>
+      </w:pPr>
+      <w:r>
+        <w:rPr>
+          <w:rFonts w:ascii="Calibri" w:cs="Calibri" w:eastAsia="Calibri" w:hAnsi="Calibri"/>
+          <w:sz w:val="24"/>
+          <w:szCs w:val="24"/>
+        </w:rPr>
+        <w:t xml:space="preserve">☐  </w:t>
+      </w:r>
+      <w:r>
+        <w:rPr>
+          <w:rFonts w:ascii="Calibri" w:cs="Calibri" w:eastAsia="Calibri" w:hAnsi="Calibri"/>
+          <w:sz w:val="21"/>
+          <w:szCs w:val="21"/>
+        </w:rPr>
+        <w:t xml:space="preserve">Every day, 24 hours</w:t>
+      </w:r>
+    </w:p>
+    <w:p>
+      <w:pPr>
+        <w:keepNext/>
+        <w:spacing w:after="30"/>
+        <w:ind w:left="500"/>
+      </w:pPr>
+      <w:r>
+        <w:rPr>
+          <w:rFonts w:ascii="Calibri" w:cs="Calibri" w:eastAsia="Calibri" w:hAnsi="Calibri"/>
+          <w:sz w:val="24"/>
+          <w:szCs w:val="24"/>
+        </w:rPr>
+        <w:t xml:space="preserve">☐  </w:t>
+      </w:r>
+      <w:r>
+        <w:rPr>
+          <w:rFonts w:ascii="Calibri" w:cs="Calibri" w:eastAsia="Calibri" w:hAnsi="Calibri"/>
+          <w:sz w:val="21"/>
+          <w:szCs w:val="21"/>
+        </w:rPr>
+        <w:t xml:space="preserve">Not sure</w:t>
       </w:r>
     </w:p>
     <w:p>
@@ -2811,7 +2381,7 @@
           <w:sz w:val="28"/>
           <w:szCs w:val="28"/>
         </w:rPr>
-        <w:t xml:space="preserve">5.  Team, Support and Go-Live</w:t>
+        <w:t xml:space="preserve">3.  Email, Web Address and Sign-in</w:t>
       </w:r>
     </w:p>
     <w:p>
@@ -2827,7 +2397,7 @@
           <w:sz w:val="21"/>
           <w:szCs w:val="21"/>
         </w:rPr>
-        <w:t xml:space="preserve">Determines the support, training and handover ZIDA needs.</w:t>
+        <w:t xml:space="preserve">Lets platform emails and staff logins work with ZIDA’s existing accounts.</w:t>
       </w:r>
     </w:p>
     <w:p>
@@ -2844,7 +2414,1180 @@
           <w:sz w:val="21"/>
           <w:szCs w:val="21"/>
         </w:rPr>
+        <w:t xml:space="preserve">9.  </w:t>
+      </w:r>
+      <w:r>
+        <w:rPr>
+          <w:rFonts w:ascii="Calibri" w:cs="Calibri" w:eastAsia="Calibri" w:hAnsi="Calibri"/>
+          <w:b/>
+          <w:bCs/>
+          <w:sz w:val="21"/>
+          <w:szCs w:val="21"/>
+        </w:rPr>
+        <w:t xml:space="preserve">Which email service does ZIDA use?</w:t>
+      </w:r>
+    </w:p>
+    <w:p>
+      <w:pPr>
+        <w:keepNext/>
+        <w:spacing w:after="30"/>
+        <w:ind w:left="500"/>
+      </w:pPr>
+      <w:r>
+        <w:rPr>
+          <w:rFonts w:ascii="Calibri" w:cs="Calibri" w:eastAsia="Calibri" w:hAnsi="Calibri"/>
+          <w:sz w:val="24"/>
+          <w:szCs w:val="24"/>
+        </w:rPr>
+        <w:t xml:space="preserve">☐  </w:t>
+      </w:r>
+      <w:r>
+        <w:rPr>
+          <w:rFonts w:ascii="Calibri" w:cs="Calibri" w:eastAsia="Calibri" w:hAnsi="Calibri"/>
+          <w:sz w:val="21"/>
+          <w:szCs w:val="21"/>
+        </w:rPr>
+        <w:t xml:space="preserve">Microsoft 365 (Outlook)</w:t>
+      </w:r>
+    </w:p>
+    <w:p>
+      <w:pPr>
+        <w:keepNext/>
+        <w:spacing w:after="30"/>
+        <w:ind w:left="500"/>
+      </w:pPr>
+      <w:r>
+        <w:rPr>
+          <w:rFonts w:ascii="Calibri" w:cs="Calibri" w:eastAsia="Calibri" w:hAnsi="Calibri"/>
+          <w:sz w:val="24"/>
+          <w:szCs w:val="24"/>
+        </w:rPr>
+        <w:t xml:space="preserve">☐  </w:t>
+      </w:r>
+      <w:r>
+        <w:rPr>
+          <w:rFonts w:ascii="Calibri" w:cs="Calibri" w:eastAsia="Calibri" w:hAnsi="Calibri"/>
+          <w:sz w:val="21"/>
+          <w:szCs w:val="21"/>
+        </w:rPr>
+        <w:t xml:space="preserve">Google Workspace (Gmail)</w:t>
+      </w:r>
+    </w:p>
+    <w:p>
+      <w:pPr>
+        <w:keepNext/>
+        <w:spacing w:after="30"/>
+        <w:ind w:left="500"/>
+      </w:pPr>
+      <w:r>
+        <w:rPr>
+          <w:rFonts w:ascii="Calibri" w:cs="Calibri" w:eastAsia="Calibri" w:hAnsi="Calibri"/>
+          <w:sz w:val="24"/>
+          <w:szCs w:val="24"/>
+        </w:rPr>
+        <w:t xml:space="preserve">☐  </w:t>
+      </w:r>
+      <w:r>
+        <w:rPr>
+          <w:rFonts w:ascii="Calibri" w:cs="Calibri" w:eastAsia="Calibri" w:hAnsi="Calibri"/>
+          <w:sz w:val="21"/>
+          <w:szCs w:val="21"/>
+        </w:rPr>
+        <w:t xml:space="preserve">ZIDA’s own email server</w:t>
+      </w:r>
+    </w:p>
+    <w:p>
+      <w:pPr>
+        <w:keepNext/>
+        <w:spacing w:after="30"/>
+        <w:ind w:left="500"/>
+      </w:pPr>
+      <w:r>
+        <w:rPr>
+          <w:rFonts w:ascii="Calibri" w:cs="Calibri" w:eastAsia="Calibri" w:hAnsi="Calibri"/>
+          <w:sz w:val="24"/>
+          <w:szCs w:val="24"/>
+        </w:rPr>
+        <w:t xml:space="preserve">☐  </w:t>
+      </w:r>
+      <w:r>
+        <w:rPr>
+          <w:rFonts w:ascii="Calibri" w:cs="Calibri" w:eastAsia="Calibri" w:hAnsi="Calibri"/>
+          <w:sz w:val="21"/>
+          <w:szCs w:val="21"/>
+        </w:rPr>
+        <w:t xml:space="preserve">Other</w:t>
+      </w:r>
+    </w:p>
+    <w:p>
+      <w:pPr>
+        <w:keepNext/>
+        <w:spacing w:after="30"/>
+        <w:ind w:left="500"/>
+      </w:pPr>
+      <w:r>
+        <w:rPr>
+          <w:rFonts w:ascii="Calibri" w:cs="Calibri" w:eastAsia="Calibri" w:hAnsi="Calibri"/>
+          <w:sz w:val="24"/>
+          <w:szCs w:val="24"/>
+        </w:rPr>
+        <w:t xml:space="preserve">☐  </w:t>
+      </w:r>
+      <w:r>
+        <w:rPr>
+          <w:rFonts w:ascii="Calibri" w:cs="Calibri" w:eastAsia="Calibri" w:hAnsi="Calibri"/>
+          <w:sz w:val="21"/>
+          <w:szCs w:val="21"/>
+        </w:rPr>
+        <w:t xml:space="preserve">Not sure</w:t>
+      </w:r>
+    </w:p>
+    <w:p>
+      <w:pPr>
+        <w:keepNext/>
+        <w:spacing w:after="30" w:before="60"/>
+        <w:ind w:left="500"/>
+      </w:pPr>
+      <w:r>
+        <w:rPr>
+          <w:rFonts w:ascii="Calibri" w:cs="Calibri" w:eastAsia="Calibri" w:hAnsi="Calibri"/>
+          <w:color w:val="5F6B66"/>
+          <w:sz w:val="19"/>
+          <w:szCs w:val="19"/>
+        </w:rPr>
+        <w:t xml:space="preserve">ZIDA email domain (the part after @)</w:t>
+      </w:r>
+    </w:p>
+    <w:tbl>
+      <w:tblPr>
+        <w:tblW w:type="dxa" w:w="9138"/>
+        <w:tblInd w:type="dxa" w:w="500"/>
+        <w:tblBorders>
+          <w:top w:val="single" w:color="auto" w:sz="4"/>
+          <w:left w:val="single" w:color="auto" w:sz="4"/>
+          <w:bottom w:val="single" w:color="auto" w:sz="4"/>
+          <w:right w:val="single" w:color="auto" w:sz="4"/>
+          <w:insideH w:val="single" w:color="auto" w:sz="4"/>
+          <w:insideV w:val="single" w:color="auto" w:sz="4"/>
+        </w:tblBorders>
+        <w:tblLayout w:type="fixed"/>
+      </w:tblPr>
+      <w:tblGrid>
+        <w:gridCol w:w="9138"/>
+      </w:tblGrid>
+      <w:tr>
+        <w:trPr>
+          <w:trHeight w:val="600" w:hRule="atLeast"/>
+        </w:trPr>
+        <w:tc>
+          <w:tcPr>
+            <w:tcW w:type="dxa" w:w="9138"/>
+            <w:tcBorders>
+              <w:top w:val="single" w:color="C9D3CD" w:sz="4"/>
+              <w:left w:val="single" w:color="C9D3CD" w:sz="4"/>
+              <w:bottom w:val="single" w:color="C9D3CD" w:sz="4"/>
+              <w:right w:val="single" w:color="C9D3CD" w:sz="4"/>
+            </w:tcBorders>
+            <w:shd w:fill="F4F8FC" w:color="auto" w:val="clear"/>
+            <w:tcMar>
+              <w:top w:type="dxa" w:w="60"/>
+              <w:left w:type="dxa" w:w="100"/>
+              <w:bottom w:type="dxa" w:w="60"/>
+              <w:right w:type="dxa" w:w="100"/>
+            </w:tcMar>
+          </w:tcPr>
+          <w:p>
+            <w:pPr>
+              <w:spacing w:after="100"/>
+            </w:pPr>
+            <w:r>
+              <w:rPr>
+                <w:rFonts w:ascii="Calibri" w:cs="Calibri" w:eastAsia="Calibri" w:hAnsi="Calibri"/>
+                <w:sz w:val="21"/>
+                <w:szCs w:val="21"/>
+              </w:rPr>
+              <w:t xml:space="preserve"/>
+            </w:r>
+          </w:p>
+        </w:tc>
+      </w:tr>
+    </w:tbl>
+    <w:p>
+      <w:pPr>
+        <w:keepNext/>
+        <w:spacing w:after="60" w:before="160"/>
+      </w:pPr>
+      <w:r>
+        <w:rPr>
+          <w:rFonts w:ascii="Calibri" w:cs="Calibri" w:eastAsia="Calibri" w:hAnsi="Calibri"/>
+          <w:b/>
+          <w:bCs/>
+          <w:color w:val="14532D"/>
+          <w:sz w:val="21"/>
+          <w:szCs w:val="21"/>
+        </w:rPr>
+        <w:t xml:space="preserve">10.  </w:t>
+      </w:r>
+      <w:r>
+        <w:rPr>
+          <w:rFonts w:ascii="Calibri" w:cs="Calibri" w:eastAsia="Calibri" w:hAnsi="Calibri"/>
+          <w:b/>
+          <w:bCs/>
+          <w:sz w:val="21"/>
+          <w:szCs w:val="21"/>
+        </w:rPr>
+        <w:t xml:space="preserve">Which web address should the platform use?</w:t>
+      </w:r>
+    </w:p>
+    <w:p>
+      <w:pPr>
+        <w:keepNext/>
+        <w:spacing w:after="30"/>
+        <w:ind w:left="500"/>
+      </w:pPr>
+      <w:r>
+        <w:rPr>
+          <w:rFonts w:ascii="Calibri" w:cs="Calibri" w:eastAsia="Calibri" w:hAnsi="Calibri"/>
+          <w:sz w:val="24"/>
+          <w:szCs w:val="24"/>
+        </w:rPr>
+        <w:t xml:space="preserve">☐  </w:t>
+      </w:r>
+      <w:r>
+        <w:rPr>
+          <w:rFonts w:ascii="Calibri" w:cs="Calibri" w:eastAsia="Calibri" w:hAnsi="Calibri"/>
+          <w:sz w:val="21"/>
+          <w:szCs w:val="21"/>
+        </w:rPr>
+        <w:t xml:space="preserve">Keep zidaproject.com</w:t>
+      </w:r>
+    </w:p>
+    <w:p>
+      <w:pPr>
+        <w:keepNext/>
+        <w:spacing w:after="30"/>
+        <w:ind w:left="500"/>
+      </w:pPr>
+      <w:r>
+        <w:rPr>
+          <w:rFonts w:ascii="Calibri" w:cs="Calibri" w:eastAsia="Calibri" w:hAnsi="Calibri"/>
+          <w:sz w:val="24"/>
+          <w:szCs w:val="24"/>
+        </w:rPr>
+        <w:t xml:space="preserve">☐  </w:t>
+      </w:r>
+      <w:r>
+        <w:rPr>
+          <w:rFonts w:ascii="Calibri" w:cs="Calibri" w:eastAsia="Calibri" w:hAnsi="Calibri"/>
+          <w:sz w:val="21"/>
+          <w:szCs w:val="21"/>
+        </w:rPr>
+        <w:t xml:space="preserve">A ZIDA web address</w:t>
+      </w:r>
+    </w:p>
+    <w:p>
+      <w:pPr>
+        <w:keepNext/>
+        <w:spacing w:after="30"/>
+        <w:ind w:left="500"/>
+      </w:pPr>
+      <w:r>
+        <w:rPr>
+          <w:rFonts w:ascii="Calibri" w:cs="Calibri" w:eastAsia="Calibri" w:hAnsi="Calibri"/>
+          <w:sz w:val="24"/>
+          <w:szCs w:val="24"/>
+        </w:rPr>
+        <w:t xml:space="preserve">☐  </w:t>
+      </w:r>
+      <w:r>
+        <w:rPr>
+          <w:rFonts w:ascii="Calibri" w:cs="Calibri" w:eastAsia="Calibri" w:hAnsi="Calibri"/>
+          <w:sz w:val="21"/>
+          <w:szCs w:val="21"/>
+        </w:rPr>
+        <w:t xml:space="preserve">Not sure</w:t>
+      </w:r>
+    </w:p>
+    <w:p>
+      <w:pPr>
+        <w:keepNext/>
+        <w:spacing w:after="30" w:before="60"/>
+        <w:ind w:left="500"/>
+      </w:pPr>
+      <w:r>
+        <w:rPr>
+          <w:rFonts w:ascii="Calibri" w:cs="Calibri" w:eastAsia="Calibri" w:hAnsi="Calibri"/>
+          <w:color w:val="5F6B66"/>
+          <w:sz w:val="19"/>
+          <w:szCs w:val="19"/>
+        </w:rPr>
+        <w:t xml:space="preserve">If a ZIDA web address: please list 2–3 preferred addresses</w:t>
+      </w:r>
+    </w:p>
+    <w:tbl>
+      <w:tblPr>
+        <w:tblW w:type="dxa" w:w="9138"/>
+        <w:tblInd w:type="dxa" w:w="500"/>
+        <w:tblBorders>
+          <w:top w:val="single" w:color="auto" w:sz="4"/>
+          <w:left w:val="single" w:color="auto" w:sz="4"/>
+          <w:bottom w:val="single" w:color="auto" w:sz="4"/>
+          <w:right w:val="single" w:color="auto" w:sz="4"/>
+          <w:insideH w:val="single" w:color="auto" w:sz="4"/>
+          <w:insideV w:val="single" w:color="auto" w:sz="4"/>
+        </w:tblBorders>
+        <w:tblLayout w:type="fixed"/>
+      </w:tblPr>
+      <w:tblGrid>
+        <w:gridCol w:w="9138"/>
+      </w:tblGrid>
+      <w:tr>
+        <w:trPr>
+          <w:trHeight w:val="600" w:hRule="atLeast"/>
+        </w:trPr>
+        <w:tc>
+          <w:tcPr>
+            <w:tcW w:type="dxa" w:w="9138"/>
+            <w:tcBorders>
+              <w:top w:val="single" w:color="C9D3CD" w:sz="4"/>
+              <w:left w:val="single" w:color="C9D3CD" w:sz="4"/>
+              <w:bottom w:val="single" w:color="C9D3CD" w:sz="4"/>
+              <w:right w:val="single" w:color="C9D3CD" w:sz="4"/>
+            </w:tcBorders>
+            <w:shd w:fill="F4F8FC" w:color="auto" w:val="clear"/>
+            <w:tcMar>
+              <w:top w:type="dxa" w:w="60"/>
+              <w:left w:type="dxa" w:w="100"/>
+              <w:bottom w:type="dxa" w:w="60"/>
+              <w:right w:type="dxa" w:w="100"/>
+            </w:tcMar>
+          </w:tcPr>
+          <w:p>
+            <w:pPr>
+              <w:spacing w:after="100"/>
+            </w:pPr>
+            <w:r>
+              <w:rPr>
+                <w:rFonts w:ascii="Calibri" w:cs="Calibri" w:eastAsia="Calibri" w:hAnsi="Calibri"/>
+                <w:sz w:val="21"/>
+                <w:szCs w:val="21"/>
+              </w:rPr>
+              <w:t xml:space="preserve"/>
+            </w:r>
+          </w:p>
+        </w:tc>
+      </w:tr>
+    </w:tbl>
+    <w:p>
+      <w:pPr>
+        <w:keepNext/>
+        <w:spacing w:after="30" w:before="60"/>
+        <w:ind w:left="500"/>
+      </w:pPr>
+      <w:r>
+        <w:rPr>
+          <w:rFonts w:ascii="Calibri" w:cs="Calibri" w:eastAsia="Calibri" w:hAnsi="Calibri"/>
+          <w:color w:val="5F6B66"/>
+          <w:sz w:val="19"/>
+          <w:szCs w:val="19"/>
+        </w:rPr>
+        <w:t xml:space="preserve">Who manages ZIDA’s web address (domain) today?</w:t>
+      </w:r>
+    </w:p>
+    <w:tbl>
+      <w:tblPr>
+        <w:tblW w:type="dxa" w:w="9138"/>
+        <w:tblInd w:type="dxa" w:w="500"/>
+        <w:tblBorders>
+          <w:top w:val="single" w:color="auto" w:sz="4"/>
+          <w:left w:val="single" w:color="auto" w:sz="4"/>
+          <w:bottom w:val="single" w:color="auto" w:sz="4"/>
+          <w:right w:val="single" w:color="auto" w:sz="4"/>
+          <w:insideH w:val="single" w:color="auto" w:sz="4"/>
+          <w:insideV w:val="single" w:color="auto" w:sz="4"/>
+        </w:tblBorders>
+        <w:tblLayout w:type="fixed"/>
+      </w:tblPr>
+      <w:tblGrid>
+        <w:gridCol w:w="9138"/>
+      </w:tblGrid>
+      <w:tr>
+        <w:trPr>
+          <w:trHeight w:val="600" w:hRule="atLeast"/>
+        </w:trPr>
+        <w:tc>
+          <w:tcPr>
+            <w:tcW w:type="dxa" w:w="9138"/>
+            <w:tcBorders>
+              <w:top w:val="single" w:color="C9D3CD" w:sz="4"/>
+              <w:left w:val="single" w:color="C9D3CD" w:sz="4"/>
+              <w:bottom w:val="single" w:color="C9D3CD" w:sz="4"/>
+              <w:right w:val="single" w:color="C9D3CD" w:sz="4"/>
+            </w:tcBorders>
+            <w:shd w:fill="F4F8FC" w:color="auto" w:val="clear"/>
+            <w:tcMar>
+              <w:top w:type="dxa" w:w="60"/>
+              <w:left w:type="dxa" w:w="100"/>
+              <w:bottom w:type="dxa" w:w="60"/>
+              <w:right w:type="dxa" w:w="100"/>
+            </w:tcMar>
+          </w:tcPr>
+          <w:p>
+            <w:pPr>
+              <w:spacing w:after="100"/>
+            </w:pPr>
+            <w:r>
+              <w:rPr>
+                <w:rFonts w:ascii="Calibri" w:cs="Calibri" w:eastAsia="Calibri" w:hAnsi="Calibri"/>
+                <w:sz w:val="21"/>
+                <w:szCs w:val="21"/>
+              </w:rPr>
+              <w:t xml:space="preserve"/>
+            </w:r>
+          </w:p>
+        </w:tc>
+      </w:tr>
+    </w:tbl>
+    <w:p>
+      <w:pPr>
+        <w:spacing w:before="60"/>
+        <w:ind w:left="500"/>
+      </w:pPr>
+      <w:r>
+        <w:rPr>
+          <w:rFonts w:ascii="Calibri" w:cs="Calibri" w:eastAsia="Calibri" w:hAnsi="Calibri"/>
+          <w:i/>
+          <w:iCs/>
+          <w:color w:val="14532D"/>
+          <w:sz w:val="19"/>
+          <w:szCs w:val="19"/>
+        </w:rPr>
+        <w:t xml:space="preserve">Afronovation will make every effort to secure one of the preferred addresses, or a suitable alternative.</w:t>
+      </w:r>
+    </w:p>
+    <w:p>
+      <w:pPr>
+        <w:keepNext/>
+        <w:spacing w:after="60" w:before="160"/>
+      </w:pPr>
+      <w:r>
+        <w:rPr>
+          <w:rFonts w:ascii="Calibri" w:cs="Calibri" w:eastAsia="Calibri" w:hAnsi="Calibri"/>
+          <w:b/>
+          <w:bCs/>
+          <w:color w:val="14532D"/>
+          <w:sz w:val="21"/>
+          <w:szCs w:val="21"/>
+        </w:rPr>
+        <w:t xml:space="preserve">11.  </w:t>
+      </w:r>
+      <w:r>
+        <w:rPr>
+          <w:rFonts w:ascii="Calibri" w:cs="Calibri" w:eastAsia="Calibri" w:hAnsi="Calibri"/>
+          <w:b/>
+          <w:bCs/>
+          <w:sz w:val="21"/>
+          <w:szCs w:val="21"/>
+        </w:rPr>
+        <w:t xml:space="preserve">Which email addresses may investors use to sign up?</w:t>
+      </w:r>
+    </w:p>
+    <w:p>
+      <w:pPr>
+        <w:keepNext/>
+        <w:spacing w:after="30"/>
+        <w:ind w:left="500"/>
+      </w:pPr>
+      <w:r>
+        <w:rPr>
+          <w:rFonts w:ascii="Calibri" w:cs="Calibri" w:eastAsia="Calibri" w:hAnsi="Calibri"/>
+          <w:sz w:val="24"/>
+          <w:szCs w:val="24"/>
+        </w:rPr>
+        <w:t xml:space="preserve">☐  </w:t>
+      </w:r>
+      <w:r>
+        <w:rPr>
+          <w:rFonts w:ascii="Calibri" w:cs="Calibri" w:eastAsia="Calibri" w:hAnsi="Calibri"/>
+          <w:sz w:val="21"/>
+          <w:szCs w:val="21"/>
+        </w:rPr>
+        <w:t xml:space="preserve">Corporate business email only (recommended)</w:t>
+      </w:r>
+    </w:p>
+    <w:p>
+      <w:pPr>
+        <w:keepNext/>
+        <w:spacing w:after="30"/>
+        <w:ind w:left="500"/>
+      </w:pPr>
+      <w:r>
+        <w:rPr>
+          <w:rFonts w:ascii="Calibri" w:cs="Calibri" w:eastAsia="Calibri" w:hAnsi="Calibri"/>
+          <w:sz w:val="24"/>
+          <w:szCs w:val="24"/>
+        </w:rPr>
+        <w:t xml:space="preserve">☐  </w:t>
+      </w:r>
+      <w:r>
+        <w:rPr>
+          <w:rFonts w:ascii="Calibri" w:cs="Calibri" w:eastAsia="Calibri" w:hAnsi="Calibri"/>
+          <w:sz w:val="21"/>
+          <w:szCs w:val="21"/>
+        </w:rPr>
+        <w:t xml:space="preserve">Any email, including generic addresses (Gmail, Yahoo, Hotmail, Outlook)</w:t>
+      </w:r>
+    </w:p>
+    <w:p>
+      <w:pPr>
+        <w:keepNext/>
+        <w:spacing w:after="30"/>
+        <w:ind w:left="500"/>
+      </w:pPr>
+      <w:r>
+        <w:rPr>
+          <w:rFonts w:ascii="Calibri" w:cs="Calibri" w:eastAsia="Calibri" w:hAnsi="Calibri"/>
+          <w:sz w:val="24"/>
+          <w:szCs w:val="24"/>
+        </w:rPr>
+        <w:t xml:space="preserve">☐  </w:t>
+      </w:r>
+      <w:r>
+        <w:rPr>
+          <w:rFonts w:ascii="Calibri" w:cs="Calibri" w:eastAsia="Calibri" w:hAnsi="Calibri"/>
+          <w:sz w:val="21"/>
+          <w:szCs w:val="21"/>
+        </w:rPr>
+        <w:t xml:space="preserve">Not sure</w:t>
+      </w:r>
+    </w:p>
+    <w:p>
+      <w:pPr>
+        <w:spacing w:before="60"/>
+        <w:ind w:left="500"/>
+      </w:pPr>
+      <w:r>
+        <w:rPr>
+          <w:rFonts w:ascii="Calibri" w:cs="Calibri" w:eastAsia="Calibri" w:hAnsi="Calibri"/>
+          <w:i/>
+          <w:iCs/>
+          <w:color w:val="14532D"/>
+          <w:sz w:val="19"/>
+          <w:szCs w:val="19"/>
+        </w:rPr>
+        <w:t xml:space="preserve">ZidaProject is designed to accept corporate business email only, for investor credibility, with two-step verification (2FA) enforced from the start.</w:t>
+      </w:r>
+    </w:p>
+    <w:p>
+      <w:pPr>
+        <w:keepNext/>
+        <w:spacing w:after="60" w:before="160"/>
+      </w:pPr>
+      <w:r>
+        <w:rPr>
+          <w:rFonts w:ascii="Calibri" w:cs="Calibri" w:eastAsia="Calibri" w:hAnsi="Calibri"/>
+          <w:b/>
+          <w:bCs/>
+          <w:color w:val="14532D"/>
+          <w:sz w:val="21"/>
+          <w:szCs w:val="21"/>
+        </w:rPr>
+        <w:t xml:space="preserve">12.  </w:t>
+      </w:r>
+      <w:r>
+        <w:rPr>
+          <w:rFonts w:ascii="Calibri" w:cs="Calibri" w:eastAsia="Calibri" w:hAnsi="Calibri"/>
+          <w:b/>
+          <w:bCs/>
+          <w:sz w:val="21"/>
+          <w:szCs w:val="21"/>
+        </w:rPr>
+        <w:t xml:space="preserve">Should ZIDA staff sign in using their existing ZIDA work account?</w:t>
+      </w:r>
+    </w:p>
+    <w:p>
+      <w:pPr>
+        <w:keepNext/>
+        <w:spacing w:after="30"/>
+        <w:ind w:left="500"/>
+      </w:pPr>
+      <w:r>
+        <w:rPr>
+          <w:rFonts w:ascii="Calibri" w:cs="Calibri" w:eastAsia="Calibri" w:hAnsi="Calibri"/>
+          <w:sz w:val="24"/>
+          <w:szCs w:val="24"/>
+        </w:rPr>
+        <w:t xml:space="preserve">☐  </w:t>
+      </w:r>
+      <w:r>
+        <w:rPr>
+          <w:rFonts w:ascii="Calibri" w:cs="Calibri" w:eastAsia="Calibri" w:hAnsi="Calibri"/>
+          <w:sz w:val="21"/>
+          <w:szCs w:val="21"/>
+        </w:rPr>
+        <w:t xml:space="preserve">Yes</w:t>
+      </w:r>
+    </w:p>
+    <w:p>
+      <w:pPr>
+        <w:keepNext/>
+        <w:spacing w:after="30"/>
+        <w:ind w:left="500"/>
+      </w:pPr>
+      <w:r>
+        <w:rPr>
+          <w:rFonts w:ascii="Calibri" w:cs="Calibri" w:eastAsia="Calibri" w:hAnsi="Calibri"/>
+          <w:sz w:val="24"/>
+          <w:szCs w:val="24"/>
+        </w:rPr>
+        <w:t xml:space="preserve">☐  </w:t>
+      </w:r>
+      <w:r>
+        <w:rPr>
+          <w:rFonts w:ascii="Calibri" w:cs="Calibri" w:eastAsia="Calibri" w:hAnsi="Calibri"/>
+          <w:sz w:val="21"/>
+          <w:szCs w:val="21"/>
+        </w:rPr>
+        <w:t xml:space="preserve">No, a separate login is fine</w:t>
+      </w:r>
+    </w:p>
+    <w:p>
+      <w:pPr>
+        <w:keepNext/>
+        <w:spacing w:after="30"/>
+        <w:ind w:left="500"/>
+      </w:pPr>
+      <w:r>
+        <w:rPr>
+          <w:rFonts w:ascii="Calibri" w:cs="Calibri" w:eastAsia="Calibri" w:hAnsi="Calibri"/>
+          <w:sz w:val="24"/>
+          <w:szCs w:val="24"/>
+        </w:rPr>
+        <w:t xml:space="preserve">☐  </w:t>
+      </w:r>
+      <w:r>
+        <w:rPr>
+          <w:rFonts w:ascii="Calibri" w:cs="Calibri" w:eastAsia="Calibri" w:hAnsi="Calibri"/>
+          <w:sz w:val="21"/>
+          <w:szCs w:val="21"/>
+        </w:rPr>
+        <w:t xml:space="preserve">Not sure</w:t>
+      </w:r>
+    </w:p>
+    <w:p>
+      <w:pPr>
+        <w:keepNext/>
+        <w:pBdr>
+          <w:bottom w:val="single" w:color="B8860B" w:sz="6" w:space="4"/>
+        </w:pBdr>
+        <w:spacing w:after="60" w:before="300"/>
+      </w:pPr>
+      <w:r>
+        <w:rPr>
+          <w:rFonts w:ascii="Calibri" w:cs="Calibri" w:eastAsia="Calibri" w:hAnsi="Calibri"/>
+          <w:b/>
+          <w:bCs/>
+          <w:color w:val="14532D"/>
+          <w:sz w:val="28"/>
+          <w:szCs w:val="28"/>
+        </w:rPr>
+        <w:t xml:space="preserve">4.  Connections and Processes</w:t>
+      </w:r>
+    </w:p>
+    <w:p>
+      <w:pPr>
+        <w:spacing w:after="100"/>
+      </w:pPr>
+      <w:r>
+        <w:rPr>
+          <w:rFonts w:ascii="Calibri" w:cs="Calibri" w:eastAsia="Calibri" w:hAnsi="Calibri"/>
+          <w:i/>
+          <w:iCs/>
+          <w:color w:val="5F6B66"/>
+          <w:sz w:val="21"/>
+          <w:szCs w:val="21"/>
+        </w:rPr>
+        <w:t xml:space="preserve">Shows how ZidaProject fits with ZIDA’s other platforms and ways of working.</w:t>
+      </w:r>
+    </w:p>
+    <w:p>
+      <w:pPr>
+        <w:keepNext/>
+        <w:spacing w:after="60" w:before="160"/>
+      </w:pPr>
+      <w:r>
+        <w:rPr>
+          <w:rFonts w:ascii="Calibri" w:cs="Calibri" w:eastAsia="Calibri" w:hAnsi="Calibri"/>
+          <w:b/>
+          <w:bCs/>
+          <w:color w:val="14532D"/>
+          <w:sz w:val="21"/>
+          <w:szCs w:val="21"/>
+        </w:rPr>
         <w:t xml:space="preserve">13.  </w:t>
+      </w:r>
+      <w:r>
+        <w:rPr>
+          <w:rFonts w:ascii="Calibri" w:cs="Calibri" w:eastAsia="Calibri" w:hAnsi="Calibri"/>
+          <w:b/>
+          <w:bCs/>
+          <w:sz w:val="21"/>
+          <w:szCs w:val="21"/>
+        </w:rPr>
+        <w:t xml:space="preserve">Should ZidaProject connect with other ZIDA-owned platforms, or run independently?</w:t>
+      </w:r>
+    </w:p>
+    <w:p>
+      <w:pPr>
+        <w:keepNext/>
+        <w:spacing w:after="30"/>
+        <w:ind w:left="500"/>
+      </w:pPr>
+      <w:r>
+        <w:rPr>
+          <w:rFonts w:ascii="Calibri" w:cs="Calibri" w:eastAsia="Calibri" w:hAnsi="Calibri"/>
+          <w:sz w:val="24"/>
+          <w:szCs w:val="24"/>
+        </w:rPr>
+        <w:t xml:space="preserve">☐  </w:t>
+      </w:r>
+      <w:r>
+        <w:rPr>
+          <w:rFonts w:ascii="Calibri" w:cs="Calibri" w:eastAsia="Calibri" w:hAnsi="Calibri"/>
+          <w:sz w:val="21"/>
+          <w:szCs w:val="21"/>
+        </w:rPr>
+        <w:t xml:space="preserve">Run independently</w:t>
+      </w:r>
+    </w:p>
+    <w:p>
+      <w:pPr>
+        <w:keepNext/>
+        <w:spacing w:after="30"/>
+        <w:ind w:left="500"/>
+      </w:pPr>
+      <w:r>
+        <w:rPr>
+          <w:rFonts w:ascii="Calibri" w:cs="Calibri" w:eastAsia="Calibri" w:hAnsi="Calibri"/>
+          <w:sz w:val="24"/>
+          <w:szCs w:val="24"/>
+        </w:rPr>
+        <w:t xml:space="preserve">☐  </w:t>
+      </w:r>
+      <w:r>
+        <w:rPr>
+          <w:rFonts w:ascii="Calibri" w:cs="Calibri" w:eastAsia="Calibri" w:hAnsi="Calibri"/>
+          <w:sz w:val="21"/>
+          <w:szCs w:val="21"/>
+        </w:rPr>
+        <w:t xml:space="preserve">Connect with other ZIDA platforms (name them below)</w:t>
+      </w:r>
+    </w:p>
+    <w:p>
+      <w:pPr>
+        <w:keepNext/>
+        <w:spacing w:after="30"/>
+        <w:ind w:left="500"/>
+      </w:pPr>
+      <w:r>
+        <w:rPr>
+          <w:rFonts w:ascii="Calibri" w:cs="Calibri" w:eastAsia="Calibri" w:hAnsi="Calibri"/>
+          <w:sz w:val="24"/>
+          <w:szCs w:val="24"/>
+        </w:rPr>
+        <w:t xml:space="preserve">☐  </w:t>
+      </w:r>
+      <w:r>
+        <w:rPr>
+          <w:rFonts w:ascii="Calibri" w:cs="Calibri" w:eastAsia="Calibri" w:hAnsi="Calibri"/>
+          <w:sz w:val="21"/>
+          <w:szCs w:val="21"/>
+        </w:rPr>
+        <w:t xml:space="preserve">Not sure</w:t>
+      </w:r>
+    </w:p>
+    <w:p>
+      <w:pPr>
+        <w:keepNext/>
+        <w:spacing w:after="30" w:before="60"/>
+        <w:ind w:left="500"/>
+      </w:pPr>
+      <w:r>
+        <w:rPr>
+          <w:rFonts w:ascii="Calibri" w:cs="Calibri" w:eastAsia="Calibri" w:hAnsi="Calibri"/>
+          <w:color w:val="5F6B66"/>
+          <w:sz w:val="19"/>
+          <w:szCs w:val="19"/>
+        </w:rPr>
+        <w:t xml:space="preserve">Platforms to connect (e.g. ZIDA website, investment licensing, CRM)</w:t>
+      </w:r>
+    </w:p>
+    <w:tbl>
+      <w:tblPr>
+        <w:tblW w:type="dxa" w:w="9138"/>
+        <w:tblInd w:type="dxa" w:w="500"/>
+        <w:tblBorders>
+          <w:top w:val="single" w:color="auto" w:sz="4"/>
+          <w:left w:val="single" w:color="auto" w:sz="4"/>
+          <w:bottom w:val="single" w:color="auto" w:sz="4"/>
+          <w:right w:val="single" w:color="auto" w:sz="4"/>
+          <w:insideH w:val="single" w:color="auto" w:sz="4"/>
+          <w:insideV w:val="single" w:color="auto" w:sz="4"/>
+        </w:tblBorders>
+        <w:tblLayout w:type="fixed"/>
+      </w:tblPr>
+      <w:tblGrid>
+        <w:gridCol w:w="9138"/>
+      </w:tblGrid>
+      <w:tr>
+        <w:trPr>
+          <w:trHeight w:val="600" w:hRule="atLeast"/>
+        </w:trPr>
+        <w:tc>
+          <w:tcPr>
+            <w:tcW w:type="dxa" w:w="9138"/>
+            <w:tcBorders>
+              <w:top w:val="single" w:color="C9D3CD" w:sz="4"/>
+              <w:left w:val="single" w:color="C9D3CD" w:sz="4"/>
+              <w:bottom w:val="single" w:color="C9D3CD" w:sz="4"/>
+              <w:right w:val="single" w:color="C9D3CD" w:sz="4"/>
+            </w:tcBorders>
+            <w:shd w:fill="F4F8FC" w:color="auto" w:val="clear"/>
+            <w:tcMar>
+              <w:top w:type="dxa" w:w="60"/>
+              <w:left w:type="dxa" w:w="100"/>
+              <w:bottom w:type="dxa" w:w="60"/>
+              <w:right w:type="dxa" w:w="100"/>
+            </w:tcMar>
+          </w:tcPr>
+          <w:p>
+            <w:pPr>
+              <w:spacing w:after="100"/>
+            </w:pPr>
+            <w:r>
+              <w:rPr>
+                <w:rFonts w:ascii="Calibri" w:cs="Calibri" w:eastAsia="Calibri" w:hAnsi="Calibri"/>
+                <w:sz w:val="21"/>
+                <w:szCs w:val="21"/>
+              </w:rPr>
+              <w:t xml:space="preserve"/>
+            </w:r>
+          </w:p>
+        </w:tc>
+      </w:tr>
+    </w:tbl>
+    <w:p>
+      <w:pPr>
+        <w:keepNext/>
+        <w:spacing w:after="60" w:before="160"/>
+      </w:pPr>
+      <w:r>
+        <w:rPr>
+          <w:rFonts w:ascii="Calibri" w:cs="Calibri" w:eastAsia="Calibri" w:hAnsi="Calibri"/>
+          <w:b/>
+          <w:bCs/>
+          <w:color w:val="14532D"/>
+          <w:sz w:val="21"/>
+          <w:szCs w:val="21"/>
+        </w:rPr>
+        <w:t xml:space="preserve">14.  </w:t>
+      </w:r>
+      <w:r>
+        <w:rPr>
+          <w:rFonts w:ascii="Calibri" w:cs="Calibri" w:eastAsia="Calibri" w:hAnsi="Calibri"/>
+          <w:b/>
+          <w:bCs/>
+          <w:sz w:val="21"/>
+          <w:szCs w:val="21"/>
+        </w:rPr>
+        <w:t xml:space="preserve">Which ZIDA processes should the platform support or reflect?</w:t>
+      </w:r>
+      <w:r>
+        <w:rPr>
+          <w:rFonts w:ascii="Calibri" w:cs="Calibri" w:eastAsia="Calibri" w:hAnsi="Calibri"/>
+          <w:color w:val="5F6B66"/>
+          <w:sz w:val="18"/>
+          <w:szCs w:val="18"/>
+        </w:rPr>
+        <w:t xml:space="preserve">  (tick all that apply)</w:t>
+      </w:r>
+    </w:p>
+    <w:p>
+      <w:pPr>
+        <w:keepNext/>
+        <w:spacing w:after="30"/>
+        <w:ind w:left="500"/>
+      </w:pPr>
+      <w:r>
+        <w:rPr>
+          <w:rFonts w:ascii="Calibri" w:cs="Calibri" w:eastAsia="Calibri" w:hAnsi="Calibri"/>
+          <w:sz w:val="24"/>
+          <w:szCs w:val="24"/>
+        </w:rPr>
+        <w:t xml:space="preserve">☐  </w:t>
+      </w:r>
+      <w:r>
+        <w:rPr>
+          <w:rFonts w:ascii="Calibri" w:cs="Calibri" w:eastAsia="Calibri" w:hAnsi="Calibri"/>
+          <w:sz w:val="21"/>
+          <w:szCs w:val="21"/>
+        </w:rPr>
+        <w:t xml:space="preserve">Project intake and onboarding</w:t>
+      </w:r>
+    </w:p>
+    <w:p>
+      <w:pPr>
+        <w:keepNext/>
+        <w:spacing w:after="30"/>
+        <w:ind w:left="500"/>
+      </w:pPr>
+      <w:r>
+        <w:rPr>
+          <w:rFonts w:ascii="Calibri" w:cs="Calibri" w:eastAsia="Calibri" w:hAnsi="Calibri"/>
+          <w:sz w:val="24"/>
+          <w:szCs w:val="24"/>
+        </w:rPr>
+        <w:t xml:space="preserve">☐  </w:t>
+      </w:r>
+      <w:r>
+        <w:rPr>
+          <w:rFonts w:ascii="Calibri" w:cs="Calibri" w:eastAsia="Calibri" w:hAnsi="Calibri"/>
+          <w:sz w:val="21"/>
+          <w:szCs w:val="21"/>
+        </w:rPr>
+        <w:t xml:space="preserve">Project scoring or ranking</w:t>
+      </w:r>
+    </w:p>
+    <w:p>
+      <w:pPr>
+        <w:keepNext/>
+        <w:spacing w:after="30"/>
+        <w:ind w:left="500"/>
+      </w:pPr>
+      <w:r>
+        <w:rPr>
+          <w:rFonts w:ascii="Calibri" w:cs="Calibri" w:eastAsia="Calibri" w:hAnsi="Calibri"/>
+          <w:sz w:val="24"/>
+          <w:szCs w:val="24"/>
+        </w:rPr>
+        <w:t xml:space="preserve">☐  </w:t>
+      </w:r>
+      <w:r>
+        <w:rPr>
+          <w:rFonts w:ascii="Calibri" w:cs="Calibri" w:eastAsia="Calibri" w:hAnsi="Calibri"/>
+          <w:sz w:val="21"/>
+          <w:szCs w:val="21"/>
+        </w:rPr>
+        <w:t xml:space="preserve">Project review and approval</w:t>
+      </w:r>
+    </w:p>
+    <w:p>
+      <w:pPr>
+        <w:keepNext/>
+        <w:spacing w:after="30"/>
+        <w:ind w:left="500"/>
+      </w:pPr>
+      <w:r>
+        <w:rPr>
+          <w:rFonts w:ascii="Calibri" w:cs="Calibri" w:eastAsia="Calibri" w:hAnsi="Calibri"/>
+          <w:sz w:val="24"/>
+          <w:szCs w:val="24"/>
+        </w:rPr>
+        <w:t xml:space="preserve">☐  </w:t>
+      </w:r>
+      <w:r>
+        <w:rPr>
+          <w:rFonts w:ascii="Calibri" w:cs="Calibri" w:eastAsia="Calibri" w:hAnsi="Calibri"/>
+          <w:sz w:val="21"/>
+          <w:szCs w:val="21"/>
+        </w:rPr>
+        <w:t xml:space="preserve">Investor registration and screening</w:t>
+      </w:r>
+    </w:p>
+    <w:p>
+      <w:pPr>
+        <w:keepNext/>
+        <w:spacing w:after="30"/>
+        <w:ind w:left="500"/>
+      </w:pPr>
+      <w:r>
+        <w:rPr>
+          <w:rFonts w:ascii="Calibri" w:cs="Calibri" w:eastAsia="Calibri" w:hAnsi="Calibri"/>
+          <w:sz w:val="24"/>
+          <w:szCs w:val="24"/>
+        </w:rPr>
+        <w:t xml:space="preserve">☐  </w:t>
+      </w:r>
+      <w:r>
+        <w:rPr>
+          <w:rFonts w:ascii="Calibri" w:cs="Calibri" w:eastAsia="Calibri" w:hAnsi="Calibri"/>
+          <w:sz w:val="21"/>
+          <w:szCs w:val="21"/>
+        </w:rPr>
+        <w:t xml:space="preserve">Reporting to management or the Board</w:t>
+      </w:r>
+    </w:p>
+    <w:p>
+      <w:pPr>
+        <w:keepNext/>
+        <w:spacing w:after="30"/>
+        <w:ind w:left="500"/>
+      </w:pPr>
+      <w:r>
+        <w:rPr>
+          <w:rFonts w:ascii="Calibri" w:cs="Calibri" w:eastAsia="Calibri" w:hAnsi="Calibri"/>
+          <w:sz w:val="24"/>
+          <w:szCs w:val="24"/>
+        </w:rPr>
+        <w:t xml:space="preserve">☐  </w:t>
+      </w:r>
+      <w:r>
+        <w:rPr>
+          <w:rFonts w:ascii="Calibri" w:cs="Calibri" w:eastAsia="Calibri" w:hAnsi="Calibri"/>
+          <w:sz w:val="21"/>
+          <w:szCs w:val="21"/>
+        </w:rPr>
+        <w:t xml:space="preserve">Other</w:t>
+      </w:r>
+    </w:p>
+    <w:p>
+      <w:pPr>
+        <w:keepNext/>
+        <w:spacing w:after="30" w:before="60"/>
+        <w:ind w:left="500"/>
+      </w:pPr>
+      <w:r>
+        <w:rPr>
+          <w:rFonts w:ascii="Calibri" w:cs="Calibri" w:eastAsia="Calibri" w:hAnsi="Calibri"/>
+          <w:color w:val="5F6B66"/>
+          <w:sz w:val="19"/>
+          <w:szCs w:val="19"/>
+        </w:rPr>
+        <w:t xml:space="preserve">Brief description of these processes</w:t>
+      </w:r>
+    </w:p>
+    <w:tbl>
+      <w:tblPr>
+        <w:tblW w:type="dxa" w:w="9138"/>
+        <w:tblInd w:type="dxa" w:w="500"/>
+        <w:tblBorders>
+          <w:top w:val="single" w:color="auto" w:sz="4"/>
+          <w:left w:val="single" w:color="auto" w:sz="4"/>
+          <w:bottom w:val="single" w:color="auto" w:sz="4"/>
+          <w:right w:val="single" w:color="auto" w:sz="4"/>
+          <w:insideH w:val="single" w:color="auto" w:sz="4"/>
+          <w:insideV w:val="single" w:color="auto" w:sz="4"/>
+        </w:tblBorders>
+        <w:tblLayout w:type="fixed"/>
+      </w:tblPr>
+      <w:tblGrid>
+        <w:gridCol w:w="9138"/>
+      </w:tblGrid>
+      <w:tr>
+        <w:trPr>
+          <w:trHeight w:val="600" w:hRule="atLeast"/>
+        </w:trPr>
+        <w:tc>
+          <w:tcPr>
+            <w:tcW w:type="dxa" w:w="9138"/>
+            <w:tcBorders>
+              <w:top w:val="single" w:color="C9D3CD" w:sz="4"/>
+              <w:left w:val="single" w:color="C9D3CD" w:sz="4"/>
+              <w:bottom w:val="single" w:color="C9D3CD" w:sz="4"/>
+              <w:right w:val="single" w:color="C9D3CD" w:sz="4"/>
+            </w:tcBorders>
+            <w:shd w:fill="F4F8FC" w:color="auto" w:val="clear"/>
+            <w:tcMar>
+              <w:top w:type="dxa" w:w="60"/>
+              <w:left w:type="dxa" w:w="100"/>
+              <w:bottom w:type="dxa" w:w="60"/>
+              <w:right w:type="dxa" w:w="100"/>
+            </w:tcMar>
+          </w:tcPr>
+          <w:p>
+            <w:pPr>
+              <w:spacing w:after="100"/>
+            </w:pPr>
+            <w:r>
+              <w:rPr>
+                <w:rFonts w:ascii="Calibri" w:cs="Calibri" w:eastAsia="Calibri" w:hAnsi="Calibri"/>
+                <w:sz w:val="21"/>
+                <w:szCs w:val="21"/>
+              </w:rPr>
+              <w:t xml:space="preserve"/>
+            </w:r>
+          </w:p>
+        </w:tc>
+      </w:tr>
+    </w:tbl>
+    <w:p>
+      <w:pPr>
+        <w:spacing w:before="60"/>
+        <w:ind w:left="500"/>
+      </w:pPr>
+      <w:r>
+        <w:rPr>
+          <w:rFonts w:ascii="Calibri" w:cs="Calibri" w:eastAsia="Calibri" w:hAnsi="Calibri"/>
+          <w:i/>
+          <w:iCs/>
+          <w:color w:val="14532D"/>
+          <w:sz w:val="19"/>
+          <w:szCs w:val="19"/>
+        </w:rPr>
+        <w:t xml:space="preserve">Please attach copies of the related process documents, forms, templates and scoring sheets.</w:t>
+      </w:r>
+    </w:p>
+    <w:p>
+      <w:pPr>
+        <w:keepNext/>
+        <w:pBdr>
+          <w:bottom w:val="single" w:color="B8860B" w:sz="6" w:space="4"/>
+        </w:pBdr>
+        <w:spacing w:after="60" w:before="300"/>
+      </w:pPr>
+      <w:r>
+        <w:rPr>
+          <w:rFonts w:ascii="Calibri" w:cs="Calibri" w:eastAsia="Calibri" w:hAnsi="Calibri"/>
+          <w:b/>
+          <w:bCs/>
+          <w:color w:val="14532D"/>
+          <w:sz w:val="28"/>
+          <w:szCs w:val="28"/>
+        </w:rPr>
+        <w:t xml:space="preserve">5.  Team, Support and Go-Live</w:t>
+      </w:r>
+    </w:p>
+    <w:p>
+      <w:pPr>
+        <w:spacing w:after="100"/>
+      </w:pPr>
+      <w:r>
+        <w:rPr>
+          <w:rFonts w:ascii="Calibri" w:cs="Calibri" w:eastAsia="Calibri" w:hAnsi="Calibri"/>
+          <w:i/>
+          <w:iCs/>
+          <w:color w:val="5F6B66"/>
+          <w:sz w:val="21"/>
+          <w:szCs w:val="21"/>
+        </w:rPr>
+        <w:t xml:space="preserve">Determines the support, training and handover ZIDA needs.</w:t>
+      </w:r>
+    </w:p>
+    <w:p>
+      <w:pPr>
+        <w:keepNext/>
+        <w:spacing w:after="60" w:before="160"/>
+      </w:pPr>
+      <w:r>
+        <w:rPr>
+          <w:rFonts w:ascii="Calibri" w:cs="Calibri" w:eastAsia="Calibri" w:hAnsi="Calibri"/>
+          <w:b/>
+          <w:bCs/>
+          <w:color w:val="14532D"/>
+          <w:sz w:val="21"/>
+          <w:szCs w:val="21"/>
+        </w:rPr>
+        <w:t xml:space="preserve">15.  </w:t>
       </w:r>
       <w:r>
         <w:rPr>
@@ -3088,7 +3831,7 @@
           <w:sz w:val="21"/>
           <w:szCs w:val="21"/>
         </w:rPr>
-        <w:t xml:space="preserve">14.  </w:t>
+        <w:t xml:space="preserve">16.  </w:t>
       </w:r>
       <w:r>
         <w:rPr>
@@ -3207,7 +3950,7 @@
           <w:sz w:val="21"/>
           <w:szCs w:val="21"/>
         </w:rPr>
-        <w:t xml:space="preserve">15.  </w:t>
+        <w:t xml:space="preserve">17.  </w:t>
       </w:r>
       <w:r>
         <w:rPr>
@@ -3326,7 +4069,7 @@
           <w:sz w:val="21"/>
           <w:szCs w:val="21"/>
         </w:rPr>
-        <w:t xml:space="preserve">16.  </w:t>
+        <w:t xml:space="preserve">18.  </w:t>
       </w:r>
       <w:r>
         <w:rPr>
@@ -3478,7 +4221,7 @@
           <w:sz w:val="21"/>
           <w:szCs w:val="21"/>
         </w:rPr>
-        <w:t xml:space="preserve">17.  </w:t>
+        <w:t xml:space="preserve">19.  </w:t>
       </w:r>
       <w:r>
         <w:rPr>

</xml_diff>